<commit_message>
Update MASTER cahier de charges.docx
section 3
</commit_message>
<xml_diff>
--- a/PROJET/MASTER cahier de charges.docx
+++ b/PROJET/MASTER cahier de charges.docx
@@ -88,9 +88,19 @@
             </w:tcMar>
           </w:tcPr>
           <w:p>
-            <w:r>
-              <w:t>Titre du projet</w:t>
-            </w:r>
+            <w:proofErr w:type="spellStart"/>
+            <w:r>
+              <w:t>Titre</w:t>
+            </w:r>
+            <w:proofErr w:type="spellEnd"/>
+            <w:r>
+              <w:t xml:space="preserve"> du </w:t>
+            </w:r>
+            <w:proofErr w:type="spellStart"/>
+            <w:r>
+              <w:t>projet</w:t>
+            </w:r>
+            <w:proofErr w:type="spellEnd"/>
           </w:p>
         </w:tc>
         <w:tc>
@@ -337,8 +347,13 @@
             </w:tcMar>
           </w:tcPr>
           <w:p>
-            <w:r>
-              <w:t xml:space="preserve">Date : </w:t>
+            <w:proofErr w:type="gramStart"/>
+            <w:r>
+              <w:t>Date :</w:t>
+            </w:r>
+            <w:proofErr w:type="gramEnd"/>
+            <w:r>
+              <w:t xml:space="preserve"> </w:t>
             </w:r>
             <w:r>
               <w:t>9 Octobre 2026</w:t>
@@ -388,8 +403,13 @@
             </w:tcMar>
           </w:tcPr>
           <w:p>
-            <w:r>
-              <w:t xml:space="preserve">Date : </w:t>
+            <w:proofErr w:type="gramStart"/>
+            <w:r>
+              <w:t>Date :</w:t>
+            </w:r>
+            <w:proofErr w:type="gramEnd"/>
+            <w:r>
+              <w:t xml:space="preserve"> </w:t>
             </w:r>
           </w:p>
         </w:tc>
@@ -436,8 +456,13 @@
             </w:tcMar>
           </w:tcPr>
           <w:p>
-            <w:r>
-              <w:t xml:space="preserve">Date : </w:t>
+            <w:proofErr w:type="gramStart"/>
+            <w:r>
+              <w:t>Date :</w:t>
+            </w:r>
+            <w:proofErr w:type="gramEnd"/>
+            <w:r>
+              <w:t xml:space="preserve"> </w:t>
             </w:r>
           </w:p>
         </w:tc>
@@ -2273,11 +2298,24 @@
         <w:pStyle w:val="Titre2"/>
       </w:pPr>
       <w:bookmarkStart w:id="1" w:name="_Toc1581658713"/>
-      <w:r>
-        <w:t xml:space="preserve">Calendrier </w:t>
-      </w:r>
-      <w:r>
-        <w:t xml:space="preserve">du projet </w:t>
+      <w:proofErr w:type="spellStart"/>
+      <w:r>
+        <w:t>Calendrier</w:t>
+      </w:r>
+      <w:proofErr w:type="spellEnd"/>
+      <w:r>
+        <w:t xml:space="preserve"> </w:t>
+      </w:r>
+      <w:r>
+        <w:t xml:space="preserve">du </w:t>
+      </w:r>
+      <w:proofErr w:type="spellStart"/>
+      <w:r>
+        <w:t>projet</w:t>
+      </w:r>
+      <w:proofErr w:type="spellEnd"/>
+      <w:r>
+        <w:t xml:space="preserve"> </w:t>
       </w:r>
       <w:r>
         <w:t>à respecter</w:t>
@@ -2385,6 +2423,7 @@
                 <w:szCs w:val="20"/>
               </w:rPr>
             </w:pPr>
+            <w:proofErr w:type="spellStart"/>
             <w:r>
               <w:rPr>
                 <w:rFonts w:ascii="Aptos Narrow" w:eastAsia="Aptos Narrow" w:hAnsi="Aptos Narrow" w:cs="Aptos Narrow"/>
@@ -2394,7 +2433,19 @@
                 <w:sz w:val="20"/>
                 <w:szCs w:val="20"/>
               </w:rPr>
-              <w:t>Tâche noms</w:t>
+              <w:t>Tâche</w:t>
+            </w:r>
+            <w:proofErr w:type="spellEnd"/>
+            <w:r>
+              <w:rPr>
+                <w:rFonts w:ascii="Aptos Narrow" w:eastAsia="Aptos Narrow" w:hAnsi="Aptos Narrow" w:cs="Aptos Narrow"/>
+                <w:b/>
+                <w:bCs/>
+                <w:color w:val="000000" w:themeColor="text1"/>
+                <w:sz w:val="20"/>
+                <w:szCs w:val="20"/>
+              </w:rPr>
+              <w:t xml:space="preserve"> noms</w:t>
             </w:r>
           </w:p>
         </w:tc>
@@ -2523,7 +2574,27 @@
                 <w:sz w:val="20"/>
                 <w:szCs w:val="20"/>
               </w:rPr>
-              <w:t>Jalon #1 : Cycle de vie</w:t>
+              <w:t>Jalon #</w:t>
+            </w:r>
+            <w:proofErr w:type="gramStart"/>
+            <w:r>
+              <w:rPr>
+                <w:rFonts w:ascii="Aptos Narrow" w:eastAsia="Aptos Narrow" w:hAnsi="Aptos Narrow" w:cs="Aptos Narrow"/>
+                <w:color w:val="000000" w:themeColor="text1"/>
+                <w:sz w:val="20"/>
+                <w:szCs w:val="20"/>
+              </w:rPr>
+              <w:t>1 :</w:t>
+            </w:r>
+            <w:proofErr w:type="gramEnd"/>
+            <w:r>
+              <w:rPr>
+                <w:rFonts w:ascii="Aptos Narrow" w:eastAsia="Aptos Narrow" w:hAnsi="Aptos Narrow" w:cs="Aptos Narrow"/>
+                <w:color w:val="000000" w:themeColor="text1"/>
+                <w:sz w:val="20"/>
+                <w:szCs w:val="20"/>
+              </w:rPr>
+              <w:t xml:space="preserve"> Cycle de vie</w:t>
             </w:r>
           </w:p>
         </w:tc>
@@ -2553,6 +2624,7 @@
                 <w:szCs w:val="20"/>
               </w:rPr>
             </w:pPr>
+            <w:proofErr w:type="spellStart"/>
             <w:r>
               <w:rPr>
                 <w:rFonts w:ascii="Aptos Narrow" w:eastAsia="Aptos Narrow" w:hAnsi="Aptos Narrow" w:cs="Aptos Narrow"/>
@@ -2560,8 +2632,29 @@
                 <w:sz w:val="20"/>
                 <w:szCs w:val="20"/>
               </w:rPr>
-              <w:t>Définition du problème</w:t>
-            </w:r>
+              <w:t>Définition</w:t>
+            </w:r>
+            <w:proofErr w:type="spellEnd"/>
+            <w:r>
+              <w:rPr>
+                <w:rFonts w:ascii="Aptos Narrow" w:eastAsia="Aptos Narrow" w:hAnsi="Aptos Narrow" w:cs="Aptos Narrow"/>
+                <w:color w:val="000000" w:themeColor="text1"/>
+                <w:sz w:val="20"/>
+                <w:szCs w:val="20"/>
+              </w:rPr>
+              <w:t xml:space="preserve"> du </w:t>
+            </w:r>
+            <w:proofErr w:type="spellStart"/>
+            <w:r>
+              <w:rPr>
+                <w:rFonts w:ascii="Aptos Narrow" w:eastAsia="Aptos Narrow" w:hAnsi="Aptos Narrow" w:cs="Aptos Narrow"/>
+                <w:color w:val="000000" w:themeColor="text1"/>
+                <w:sz w:val="20"/>
+                <w:szCs w:val="20"/>
+              </w:rPr>
+              <w:t>problème</w:t>
+            </w:r>
+            <w:proofErr w:type="spellEnd"/>
           </w:p>
         </w:tc>
         <w:tc>
@@ -2679,7 +2772,27 @@
                 <w:sz w:val="20"/>
                 <w:szCs w:val="20"/>
               </w:rPr>
-              <w:t>Jalon #1 : Cycle de vie</w:t>
+              <w:t>Jalon #</w:t>
+            </w:r>
+            <w:proofErr w:type="gramStart"/>
+            <w:r>
+              <w:rPr>
+                <w:rFonts w:ascii="Aptos Narrow" w:eastAsia="Aptos Narrow" w:hAnsi="Aptos Narrow" w:cs="Aptos Narrow"/>
+                <w:color w:val="000000" w:themeColor="text1"/>
+                <w:sz w:val="20"/>
+                <w:szCs w:val="20"/>
+              </w:rPr>
+              <w:t>1 :</w:t>
+            </w:r>
+            <w:proofErr w:type="gramEnd"/>
+            <w:r>
+              <w:rPr>
+                <w:rFonts w:ascii="Aptos Narrow" w:eastAsia="Aptos Narrow" w:hAnsi="Aptos Narrow" w:cs="Aptos Narrow"/>
+                <w:color w:val="000000" w:themeColor="text1"/>
+                <w:sz w:val="20"/>
+                <w:szCs w:val="20"/>
+              </w:rPr>
+              <w:t xml:space="preserve"> Cycle de vie</w:t>
             </w:r>
           </w:p>
         </w:tc>
@@ -2709,6 +2822,7 @@
                 <w:szCs w:val="20"/>
               </w:rPr>
             </w:pPr>
+            <w:proofErr w:type="spellStart"/>
             <w:r>
               <w:rPr>
                 <w:rFonts w:ascii="Aptos Narrow" w:eastAsia="Aptos Narrow" w:hAnsi="Aptos Narrow" w:cs="Aptos Narrow"/>
@@ -2716,7 +2830,17 @@
                 <w:sz w:val="20"/>
                 <w:szCs w:val="20"/>
               </w:rPr>
-              <w:t>Collecte des données</w:t>
+              <w:t>Collecte</w:t>
+            </w:r>
+            <w:proofErr w:type="spellEnd"/>
+            <w:r>
+              <w:rPr>
+                <w:rFonts w:ascii="Aptos Narrow" w:eastAsia="Aptos Narrow" w:hAnsi="Aptos Narrow" w:cs="Aptos Narrow"/>
+                <w:color w:val="000000" w:themeColor="text1"/>
+                <w:sz w:val="20"/>
+                <w:szCs w:val="20"/>
+              </w:rPr>
+              <w:t xml:space="preserve"> des données</w:t>
             </w:r>
           </w:p>
         </w:tc>
@@ -2835,7 +2959,27 @@
                 <w:sz w:val="20"/>
                 <w:szCs w:val="20"/>
               </w:rPr>
-              <w:t>Jalon #1 : Cycle de vie</w:t>
+              <w:t>Jalon #</w:t>
+            </w:r>
+            <w:proofErr w:type="gramStart"/>
+            <w:r>
+              <w:rPr>
+                <w:rFonts w:ascii="Aptos Narrow" w:eastAsia="Aptos Narrow" w:hAnsi="Aptos Narrow" w:cs="Aptos Narrow"/>
+                <w:color w:val="000000" w:themeColor="text1"/>
+                <w:sz w:val="20"/>
+                <w:szCs w:val="20"/>
+              </w:rPr>
+              <w:t>1 :</w:t>
+            </w:r>
+            <w:proofErr w:type="gramEnd"/>
+            <w:r>
+              <w:rPr>
+                <w:rFonts w:ascii="Aptos Narrow" w:eastAsia="Aptos Narrow" w:hAnsi="Aptos Narrow" w:cs="Aptos Narrow"/>
+                <w:color w:val="000000" w:themeColor="text1"/>
+                <w:sz w:val="20"/>
+                <w:szCs w:val="20"/>
+              </w:rPr>
+              <w:t xml:space="preserve"> Cycle de vie</w:t>
             </w:r>
           </w:p>
         </w:tc>
@@ -2865,6 +3009,7 @@
                 <w:szCs w:val="20"/>
               </w:rPr>
             </w:pPr>
+            <w:proofErr w:type="spellStart"/>
             <w:r>
               <w:rPr>
                 <w:rFonts w:ascii="Aptos Narrow" w:eastAsia="Aptos Narrow" w:hAnsi="Aptos Narrow" w:cs="Aptos Narrow"/>
@@ -2872,7 +3017,17 @@
                 <w:sz w:val="20"/>
                 <w:szCs w:val="20"/>
               </w:rPr>
-              <w:t>Préparation des données (Jalon #1)</w:t>
+              <w:t>Préparation</w:t>
+            </w:r>
+            <w:proofErr w:type="spellEnd"/>
+            <w:r>
+              <w:rPr>
+                <w:rFonts w:ascii="Aptos Narrow" w:eastAsia="Aptos Narrow" w:hAnsi="Aptos Narrow" w:cs="Aptos Narrow"/>
+                <w:color w:val="000000" w:themeColor="text1"/>
+                <w:sz w:val="20"/>
+                <w:szCs w:val="20"/>
+              </w:rPr>
+              <w:t xml:space="preserve"> des données (Jalon #1)</w:t>
             </w:r>
           </w:p>
         </w:tc>
@@ -2991,8 +3146,39 @@
                 <w:sz w:val="20"/>
                 <w:szCs w:val="20"/>
               </w:rPr>
-              <w:t>Jalon #2 : Optimisation</w:t>
-            </w:r>
+              <w:t>Jalon #</w:t>
+            </w:r>
+            <w:proofErr w:type="gramStart"/>
+            <w:r>
+              <w:rPr>
+                <w:rFonts w:ascii="Aptos Narrow" w:eastAsia="Aptos Narrow" w:hAnsi="Aptos Narrow" w:cs="Aptos Narrow"/>
+                <w:color w:val="000000" w:themeColor="text1"/>
+                <w:sz w:val="20"/>
+                <w:szCs w:val="20"/>
+              </w:rPr>
+              <w:t>2 :</w:t>
+            </w:r>
+            <w:proofErr w:type="gramEnd"/>
+            <w:r>
+              <w:rPr>
+                <w:rFonts w:ascii="Aptos Narrow" w:eastAsia="Aptos Narrow" w:hAnsi="Aptos Narrow" w:cs="Aptos Narrow"/>
+                <w:color w:val="000000" w:themeColor="text1"/>
+                <w:sz w:val="20"/>
+                <w:szCs w:val="20"/>
+              </w:rPr>
+              <w:t xml:space="preserve"> </w:t>
+            </w:r>
+            <w:proofErr w:type="spellStart"/>
+            <w:r>
+              <w:rPr>
+                <w:rFonts w:ascii="Aptos Narrow" w:eastAsia="Aptos Narrow" w:hAnsi="Aptos Narrow" w:cs="Aptos Narrow"/>
+                <w:color w:val="000000" w:themeColor="text1"/>
+                <w:sz w:val="20"/>
+                <w:szCs w:val="20"/>
+              </w:rPr>
+              <w:t>Optimisation</w:t>
+            </w:r>
+            <w:proofErr w:type="spellEnd"/>
           </w:p>
         </w:tc>
         <w:tc>
@@ -3021,6 +3207,7 @@
                 <w:szCs w:val="20"/>
               </w:rPr>
             </w:pPr>
+            <w:proofErr w:type="spellStart"/>
             <w:r>
               <w:rPr>
                 <w:rFonts w:ascii="Aptos Narrow" w:eastAsia="Aptos Narrow" w:hAnsi="Aptos Narrow" w:cs="Aptos Narrow"/>
@@ -3028,7 +3215,17 @@
                 <w:sz w:val="20"/>
                 <w:szCs w:val="20"/>
               </w:rPr>
-              <w:t>Préparation des données (Jalon #2)</w:t>
+              <w:t>Préparation</w:t>
+            </w:r>
+            <w:proofErr w:type="spellEnd"/>
+            <w:r>
+              <w:rPr>
+                <w:rFonts w:ascii="Aptos Narrow" w:eastAsia="Aptos Narrow" w:hAnsi="Aptos Narrow" w:cs="Aptos Narrow"/>
+                <w:color w:val="000000" w:themeColor="text1"/>
+                <w:sz w:val="20"/>
+                <w:szCs w:val="20"/>
+              </w:rPr>
+              <w:t xml:space="preserve"> des données (Jalon #2)</w:t>
             </w:r>
           </w:p>
         </w:tc>
@@ -3147,8 +3344,39 @@
                 <w:sz w:val="20"/>
                 <w:szCs w:val="20"/>
               </w:rPr>
-              <w:t>Jalon #2 : Optimisation</w:t>
-            </w:r>
+              <w:t>Jalon #</w:t>
+            </w:r>
+            <w:proofErr w:type="gramStart"/>
+            <w:r>
+              <w:rPr>
+                <w:rFonts w:ascii="Aptos Narrow" w:eastAsia="Aptos Narrow" w:hAnsi="Aptos Narrow" w:cs="Aptos Narrow"/>
+                <w:color w:val="000000" w:themeColor="text1"/>
+                <w:sz w:val="20"/>
+                <w:szCs w:val="20"/>
+              </w:rPr>
+              <w:t>2 :</w:t>
+            </w:r>
+            <w:proofErr w:type="gramEnd"/>
+            <w:r>
+              <w:rPr>
+                <w:rFonts w:ascii="Aptos Narrow" w:eastAsia="Aptos Narrow" w:hAnsi="Aptos Narrow" w:cs="Aptos Narrow"/>
+                <w:color w:val="000000" w:themeColor="text1"/>
+                <w:sz w:val="20"/>
+                <w:szCs w:val="20"/>
+              </w:rPr>
+              <w:t xml:space="preserve"> </w:t>
+            </w:r>
+            <w:proofErr w:type="spellStart"/>
+            <w:r>
+              <w:rPr>
+                <w:rFonts w:ascii="Aptos Narrow" w:eastAsia="Aptos Narrow" w:hAnsi="Aptos Narrow" w:cs="Aptos Narrow"/>
+                <w:color w:val="000000" w:themeColor="text1"/>
+                <w:sz w:val="20"/>
+                <w:szCs w:val="20"/>
+              </w:rPr>
+              <w:t>Optimisation</w:t>
+            </w:r>
+            <w:proofErr w:type="spellEnd"/>
           </w:p>
         </w:tc>
         <w:tc>
@@ -3177,6 +3405,7 @@
                 <w:szCs w:val="20"/>
               </w:rPr>
             </w:pPr>
+            <w:proofErr w:type="spellStart"/>
             <w:r>
               <w:rPr>
                 <w:rFonts w:ascii="Aptos Narrow" w:eastAsia="Aptos Narrow" w:hAnsi="Aptos Narrow" w:cs="Aptos Narrow"/>
@@ -3186,6 +3415,7 @@
               </w:rPr>
               <w:t>Modélisation</w:t>
             </w:r>
+            <w:proofErr w:type="spellEnd"/>
           </w:p>
         </w:tc>
         <w:tc>
@@ -3303,8 +3533,39 @@
                 <w:sz w:val="20"/>
                 <w:szCs w:val="20"/>
               </w:rPr>
-              <w:t>Jalon #2 : Optimisation</w:t>
-            </w:r>
+              <w:t>Jalon #</w:t>
+            </w:r>
+            <w:proofErr w:type="gramStart"/>
+            <w:r>
+              <w:rPr>
+                <w:rFonts w:ascii="Aptos Narrow" w:eastAsia="Aptos Narrow" w:hAnsi="Aptos Narrow" w:cs="Aptos Narrow"/>
+                <w:color w:val="000000" w:themeColor="text1"/>
+                <w:sz w:val="20"/>
+                <w:szCs w:val="20"/>
+              </w:rPr>
+              <w:t>2 :</w:t>
+            </w:r>
+            <w:proofErr w:type="gramEnd"/>
+            <w:r>
+              <w:rPr>
+                <w:rFonts w:ascii="Aptos Narrow" w:eastAsia="Aptos Narrow" w:hAnsi="Aptos Narrow" w:cs="Aptos Narrow"/>
+                <w:color w:val="000000" w:themeColor="text1"/>
+                <w:sz w:val="20"/>
+                <w:szCs w:val="20"/>
+              </w:rPr>
+              <w:t xml:space="preserve"> </w:t>
+            </w:r>
+            <w:proofErr w:type="spellStart"/>
+            <w:r>
+              <w:rPr>
+                <w:rFonts w:ascii="Aptos Narrow" w:eastAsia="Aptos Narrow" w:hAnsi="Aptos Narrow" w:cs="Aptos Narrow"/>
+                <w:color w:val="000000" w:themeColor="text1"/>
+                <w:sz w:val="20"/>
+                <w:szCs w:val="20"/>
+              </w:rPr>
+              <w:t>Optimisation</w:t>
+            </w:r>
+            <w:proofErr w:type="spellEnd"/>
           </w:p>
         </w:tc>
         <w:tc>
@@ -3333,6 +3594,7 @@
                 <w:szCs w:val="20"/>
               </w:rPr>
             </w:pPr>
+            <w:proofErr w:type="spellStart"/>
             <w:r>
               <w:rPr>
                 <w:rFonts w:ascii="Aptos Narrow" w:eastAsia="Aptos Narrow" w:hAnsi="Aptos Narrow" w:cs="Aptos Narrow"/>
@@ -3342,6 +3604,7 @@
               </w:rPr>
               <w:t>Évaluation</w:t>
             </w:r>
+            <w:proofErr w:type="spellEnd"/>
           </w:p>
         </w:tc>
         <w:tc>
@@ -3459,8 +3722,39 @@
                 <w:sz w:val="20"/>
                 <w:szCs w:val="20"/>
               </w:rPr>
-              <w:t>Jalon #3 : Déploiement</w:t>
-            </w:r>
+              <w:t>Jalon #</w:t>
+            </w:r>
+            <w:proofErr w:type="gramStart"/>
+            <w:r>
+              <w:rPr>
+                <w:rFonts w:ascii="Aptos Narrow" w:eastAsia="Aptos Narrow" w:hAnsi="Aptos Narrow" w:cs="Aptos Narrow"/>
+                <w:color w:val="000000" w:themeColor="text1"/>
+                <w:sz w:val="20"/>
+                <w:szCs w:val="20"/>
+              </w:rPr>
+              <w:t>3 :</w:t>
+            </w:r>
+            <w:proofErr w:type="gramEnd"/>
+            <w:r>
+              <w:rPr>
+                <w:rFonts w:ascii="Aptos Narrow" w:eastAsia="Aptos Narrow" w:hAnsi="Aptos Narrow" w:cs="Aptos Narrow"/>
+                <w:color w:val="000000" w:themeColor="text1"/>
+                <w:sz w:val="20"/>
+                <w:szCs w:val="20"/>
+              </w:rPr>
+              <w:t xml:space="preserve"> </w:t>
+            </w:r>
+            <w:proofErr w:type="spellStart"/>
+            <w:r>
+              <w:rPr>
+                <w:rFonts w:ascii="Aptos Narrow" w:eastAsia="Aptos Narrow" w:hAnsi="Aptos Narrow" w:cs="Aptos Narrow"/>
+                <w:color w:val="000000" w:themeColor="text1"/>
+                <w:sz w:val="20"/>
+                <w:szCs w:val="20"/>
+              </w:rPr>
+              <w:t>Déploiement</w:t>
+            </w:r>
+            <w:proofErr w:type="spellEnd"/>
           </w:p>
         </w:tc>
         <w:tc>
@@ -3489,6 +3783,7 @@
                 <w:szCs w:val="20"/>
               </w:rPr>
             </w:pPr>
+            <w:proofErr w:type="spellStart"/>
             <w:r>
               <w:rPr>
                 <w:rFonts w:ascii="Aptos Narrow" w:eastAsia="Aptos Narrow" w:hAnsi="Aptos Narrow" w:cs="Aptos Narrow"/>
@@ -3498,6 +3793,7 @@
               </w:rPr>
               <w:t>Déploiement</w:t>
             </w:r>
+            <w:proofErr w:type="spellEnd"/>
           </w:p>
         </w:tc>
         <w:tc>
@@ -3615,8 +3911,39 @@
                 <w:sz w:val="20"/>
                 <w:szCs w:val="20"/>
               </w:rPr>
-              <w:t>Jalon #3 : Déploiement</w:t>
-            </w:r>
+              <w:t>Jalon #</w:t>
+            </w:r>
+            <w:proofErr w:type="gramStart"/>
+            <w:r>
+              <w:rPr>
+                <w:rFonts w:ascii="Aptos Narrow" w:eastAsia="Aptos Narrow" w:hAnsi="Aptos Narrow" w:cs="Aptos Narrow"/>
+                <w:color w:val="000000" w:themeColor="text1"/>
+                <w:sz w:val="20"/>
+                <w:szCs w:val="20"/>
+              </w:rPr>
+              <w:t>3 :</w:t>
+            </w:r>
+            <w:proofErr w:type="gramEnd"/>
+            <w:r>
+              <w:rPr>
+                <w:rFonts w:ascii="Aptos Narrow" w:eastAsia="Aptos Narrow" w:hAnsi="Aptos Narrow" w:cs="Aptos Narrow"/>
+                <w:color w:val="000000" w:themeColor="text1"/>
+                <w:sz w:val="20"/>
+                <w:szCs w:val="20"/>
+              </w:rPr>
+              <w:t xml:space="preserve"> </w:t>
+            </w:r>
+            <w:proofErr w:type="spellStart"/>
+            <w:r>
+              <w:rPr>
+                <w:rFonts w:ascii="Aptos Narrow" w:eastAsia="Aptos Narrow" w:hAnsi="Aptos Narrow" w:cs="Aptos Narrow"/>
+                <w:color w:val="000000" w:themeColor="text1"/>
+                <w:sz w:val="20"/>
+                <w:szCs w:val="20"/>
+              </w:rPr>
+              <w:t>Déploiement</w:t>
+            </w:r>
+            <w:proofErr w:type="spellEnd"/>
           </w:p>
         </w:tc>
         <w:tc>
@@ -3645,6 +3972,7 @@
                 <w:szCs w:val="20"/>
               </w:rPr>
             </w:pPr>
+            <w:proofErr w:type="spellStart"/>
             <w:r>
               <w:rPr>
                 <w:rFonts w:ascii="Aptos Narrow" w:eastAsia="Aptos Narrow" w:hAnsi="Aptos Narrow" w:cs="Aptos Narrow"/>
@@ -3652,7 +3980,17 @@
                 <w:sz w:val="20"/>
                 <w:szCs w:val="20"/>
               </w:rPr>
-              <w:t>Suivi &amp; maintenance</w:t>
+              <w:t>Suivi</w:t>
+            </w:r>
+            <w:proofErr w:type="spellEnd"/>
+            <w:r>
+              <w:rPr>
+                <w:rFonts w:ascii="Aptos Narrow" w:eastAsia="Aptos Narrow" w:hAnsi="Aptos Narrow" w:cs="Aptos Narrow"/>
+                <w:color w:val="000000" w:themeColor="text1"/>
+                <w:sz w:val="20"/>
+                <w:szCs w:val="20"/>
+              </w:rPr>
+              <w:t xml:space="preserve"> &amp; maintenance</w:t>
             </w:r>
           </w:p>
         </w:tc>
@@ -4423,6 +4761,7 @@
             <w:pPr>
               <w:jc w:val="center"/>
             </w:pPr>
+            <w:proofErr w:type="spellStart"/>
             <w:r>
               <w:rPr>
                 <w:b/>
@@ -4430,6 +4769,7 @@
               </w:rPr>
               <w:t>Unité</w:t>
             </w:r>
+            <w:proofErr w:type="spellEnd"/>
           </w:p>
         </w:tc>
         <w:tc>
@@ -4497,12 +4837,21 @@
             </w:tcMar>
           </w:tcPr>
           <w:p>
+            <w:proofErr w:type="spellStart"/>
             <w:r>
               <w:rPr>
                 <w:sz w:val="19"/>
                 <w:szCs w:val="19"/>
               </w:rPr>
-              <w:t xml:space="preserve">Unité 1 </w:t>
+              <w:t>Unité</w:t>
+            </w:r>
+            <w:proofErr w:type="spellEnd"/>
+            <w:r>
+              <w:rPr>
+                <w:sz w:val="19"/>
+                <w:szCs w:val="19"/>
+              </w:rPr>
+              <w:t xml:space="preserve"> 1 </w:t>
             </w:r>
             <w:r>
               <w:rPr>
@@ -4581,18 +4930,27 @@
             </w:tcMar>
           </w:tcPr>
           <w:p>
+            <w:proofErr w:type="spellStart"/>
             <w:r>
               <w:rPr>
                 <w:sz w:val="19"/>
                 <w:szCs w:val="19"/>
               </w:rPr>
-              <w:t xml:space="preserve">Unité 2 </w:t>
-            </w:r>
+              <w:t>Unité</w:t>
+            </w:r>
+            <w:proofErr w:type="spellEnd"/>
             <w:r>
               <w:rPr>
                 <w:sz w:val="19"/>
                 <w:szCs w:val="19"/>
               </w:rPr>
+              <w:t xml:space="preserve"> 2 </w:t>
+            </w:r>
+            <w:r>
+              <w:rPr>
+                <w:sz w:val="19"/>
+                <w:szCs w:val="19"/>
+              </w:rPr>
               <w:t>-</w:t>
             </w:r>
             <w:r>
@@ -4600,8 +4958,17 @@
                 <w:sz w:val="19"/>
                 <w:szCs w:val="19"/>
               </w:rPr>
-              <w:t xml:space="preserve"> Optimisation</w:t>
-            </w:r>
+              <w:t xml:space="preserve"> </w:t>
+            </w:r>
+            <w:proofErr w:type="spellStart"/>
+            <w:r>
+              <w:rPr>
+                <w:sz w:val="19"/>
+                <w:szCs w:val="19"/>
+              </w:rPr>
+              <w:t>Optimisation</w:t>
+            </w:r>
+            <w:proofErr w:type="spellEnd"/>
           </w:p>
         </w:tc>
         <w:tc>
@@ -4665,18 +5032,27 @@
             </w:tcMar>
           </w:tcPr>
           <w:p>
+            <w:proofErr w:type="spellStart"/>
             <w:r>
               <w:rPr>
                 <w:sz w:val="19"/>
                 <w:szCs w:val="19"/>
               </w:rPr>
-              <w:t xml:space="preserve">Unité 3 </w:t>
-            </w:r>
+              <w:t>Unité</w:t>
+            </w:r>
+            <w:proofErr w:type="spellEnd"/>
             <w:r>
               <w:rPr>
                 <w:sz w:val="19"/>
                 <w:szCs w:val="19"/>
               </w:rPr>
+              <w:t xml:space="preserve"> 3 </w:t>
+            </w:r>
+            <w:r>
+              <w:rPr>
+                <w:sz w:val="19"/>
+                <w:szCs w:val="19"/>
+              </w:rPr>
               <w:t>-</w:t>
             </w:r>
             <w:r>
@@ -4684,8 +5060,17 @@
                 <w:sz w:val="19"/>
                 <w:szCs w:val="19"/>
               </w:rPr>
-              <w:t xml:space="preserve"> Déploiement</w:t>
-            </w:r>
+              <w:t xml:space="preserve"> </w:t>
+            </w:r>
+            <w:proofErr w:type="spellStart"/>
+            <w:r>
+              <w:rPr>
+                <w:sz w:val="19"/>
+                <w:szCs w:val="19"/>
+              </w:rPr>
+              <w:t>Déploiement</w:t>
+            </w:r>
+            <w:proofErr w:type="spellEnd"/>
           </w:p>
         </w:tc>
         <w:tc>
@@ -4729,10 +5114,28 @@
         <w:spacing w:before="160" w:after="80"/>
       </w:pPr>
       <w:bookmarkStart w:id="3" w:name="_Toc1340870210"/>
-      <w:r>
-        <w:t>Informations générales du projet</w:t>
+      <w:proofErr w:type="spellStart"/>
+      <w:r>
+        <w:t>Informations</w:t>
+      </w:r>
+      <w:proofErr w:type="spellEnd"/>
+      <w:r>
+        <w:t xml:space="preserve"> </w:t>
+      </w:r>
+      <w:proofErr w:type="spellStart"/>
+      <w:r>
+        <w:t>générales</w:t>
+      </w:r>
+      <w:proofErr w:type="spellEnd"/>
+      <w:r>
+        <w:t xml:space="preserve"> du </w:t>
+      </w:r>
+      <w:proofErr w:type="spellStart"/>
+      <w:r>
+        <w:t>projet</w:t>
       </w:r>
       <w:bookmarkEnd w:id="3"/>
+      <w:proofErr w:type="spellEnd"/>
     </w:p>
     <w:tbl>
       <w:tblPr>
@@ -4767,6 +5170,7 @@
             <w:pPr>
               <w:jc w:val="center"/>
             </w:pPr>
+            <w:proofErr w:type="spellStart"/>
             <w:r>
               <w:rPr>
                 <w:b/>
@@ -4774,6 +5178,7 @@
               </w:rPr>
               <w:t>Élément</w:t>
             </w:r>
+            <w:proofErr w:type="spellEnd"/>
           </w:p>
         </w:tc>
         <w:tc>
@@ -4818,12 +5223,28 @@
             </w:tcMar>
           </w:tcPr>
           <w:p>
+            <w:proofErr w:type="spellStart"/>
             <w:r>
               <w:rPr>
                 <w:b/>
               </w:rPr>
-              <w:t>Titre du projet</w:t>
-            </w:r>
+              <w:t>Titre</w:t>
+            </w:r>
+            <w:proofErr w:type="spellEnd"/>
+            <w:r>
+              <w:rPr>
+                <w:b/>
+              </w:rPr>
+              <w:t xml:space="preserve"> du </w:t>
+            </w:r>
+            <w:proofErr w:type="spellStart"/>
+            <w:r>
+              <w:rPr>
+                <w:b/>
+              </w:rPr>
+              <w:t>projet</w:t>
+            </w:r>
+            <w:proofErr w:type="spellEnd"/>
           </w:p>
         </w:tc>
         <w:tc>
@@ -4886,12 +5307,42 @@
             </w:tcMar>
           </w:tcPr>
           <w:p>
+            <w:proofErr w:type="spellStart"/>
             <w:r>
               <w:rPr>
                 <w:b/>
               </w:rPr>
-              <w:t>Sujet / problématique attribuée</w:t>
-            </w:r>
+              <w:t>Sujet</w:t>
+            </w:r>
+            <w:proofErr w:type="spellEnd"/>
+            <w:r>
+              <w:rPr>
+                <w:b/>
+              </w:rPr>
+              <w:t xml:space="preserve"> / </w:t>
+            </w:r>
+            <w:proofErr w:type="spellStart"/>
+            <w:r>
+              <w:rPr>
+                <w:b/>
+              </w:rPr>
+              <w:t>problématique</w:t>
+            </w:r>
+            <w:proofErr w:type="spellEnd"/>
+            <w:r>
+              <w:rPr>
+                <w:b/>
+              </w:rPr>
+              <w:t xml:space="preserve"> </w:t>
+            </w:r>
+            <w:proofErr w:type="spellStart"/>
+            <w:r>
+              <w:rPr>
+                <w:b/>
+              </w:rPr>
+              <w:t>attribuée</w:t>
+            </w:r>
+            <w:proofErr w:type="spellEnd"/>
           </w:p>
         </w:tc>
         <w:tc>
@@ -5157,9 +5608,30 @@
       </w:pPr>
       <w:bookmarkStart w:id="4" w:name="_Toc688401642"/>
       <w:r>
-        <w:t>1. Présentation générale du projet</w:t>
+        <w:t xml:space="preserve">1. </w:t>
+      </w:r>
+      <w:proofErr w:type="spellStart"/>
+      <w:r>
+        <w:t>Présentation</w:t>
+      </w:r>
+      <w:proofErr w:type="spellEnd"/>
+      <w:r>
+        <w:t xml:space="preserve"> </w:t>
+      </w:r>
+      <w:proofErr w:type="spellStart"/>
+      <w:r>
+        <w:t>générale</w:t>
+      </w:r>
+      <w:proofErr w:type="spellEnd"/>
+      <w:r>
+        <w:t xml:space="preserve"> du </w:t>
+      </w:r>
+      <w:proofErr w:type="spellStart"/>
+      <w:r>
+        <w:t>projet</w:t>
       </w:r>
       <w:bookmarkEnd w:id="4"/>
+      <w:proofErr w:type="spellEnd"/>
     </w:p>
     <w:tbl>
       <w:tblPr>
@@ -5306,7 +5778,25 @@
           <w:szCs w:val="18"/>
           <w:lang w:val="fr-CA"/>
         </w:rPr>
-        <w:t>L’entreprise fictive se nomme Volarus.</w:t>
+        <w:t xml:space="preserve">L’entreprise fictive se nomme </w:t>
+      </w:r>
+      <w:proofErr w:type="spellStart"/>
+      <w:r>
+        <w:rPr>
+          <w:sz w:val="18"/>
+          <w:szCs w:val="18"/>
+          <w:lang w:val="fr-CA"/>
+        </w:rPr>
+        <w:t>Volarus</w:t>
+      </w:r>
+      <w:proofErr w:type="spellEnd"/>
+      <w:r>
+        <w:rPr>
+          <w:sz w:val="18"/>
+          <w:szCs w:val="18"/>
+          <w:lang w:val="fr-CA"/>
+        </w:rPr>
+        <w:t>.</w:t>
       </w:r>
     </w:p>
     <w:p>
@@ -5342,7 +5832,43 @@
           <w:szCs w:val="18"/>
           <w:lang w:val="fr-CA"/>
         </w:rPr>
-        <w:t xml:space="preserve"> Au états-Unis seulement</w:t>
+        <w:t xml:space="preserve"> </w:t>
+      </w:r>
+      <w:proofErr w:type="spellStart"/>
+      <w:r>
+        <w:rPr>
+          <w:sz w:val="18"/>
+          <w:szCs w:val="18"/>
+          <w:lang w:val="fr-CA"/>
+        </w:rPr>
+        <w:t>Au</w:t>
+      </w:r>
+      <w:proofErr w:type="spellEnd"/>
+      <w:r>
+        <w:rPr>
+          <w:sz w:val="18"/>
+          <w:szCs w:val="18"/>
+          <w:lang w:val="fr-CA"/>
+        </w:rPr>
+        <w:t xml:space="preserve"> </w:t>
+      </w:r>
+      <w:proofErr w:type="spellStart"/>
+      <w:r>
+        <w:rPr>
+          <w:sz w:val="18"/>
+          <w:szCs w:val="18"/>
+          <w:lang w:val="fr-CA"/>
+        </w:rPr>
+        <w:t>états-Unis</w:t>
+      </w:r>
+      <w:proofErr w:type="spellEnd"/>
+      <w:r>
+        <w:rPr>
+          <w:sz w:val="18"/>
+          <w:szCs w:val="18"/>
+          <w:lang w:val="fr-CA"/>
+        </w:rPr>
+        <w:t xml:space="preserve"> seulement</w:t>
       </w:r>
     </w:p>
     <w:p>
@@ -5370,7 +5896,25 @@
           <w:szCs w:val="18"/>
           <w:lang w:val="fr-CA"/>
         </w:rPr>
-        <w:t>Le problème étudié pourrait avoir un impact important sur l’efficacité de la gestion des vols, notamment en permettant d’anticiper les retards, d’analyser leurs causes et éventuellement de contribuer à réduire leur durée. Le projet pourrait également permettre à Volarus de mieux informer ses clients et de les aider à anticiper les retards de leurs vols.</w:t>
+        <w:t xml:space="preserve">Le problème étudié pourrait avoir un impact important sur l’efficacité de la gestion des vols, notamment en permettant d’anticiper les retards, d’analyser leurs causes et éventuellement de contribuer à réduire leur durée. Le projet pourrait également permettre à </w:t>
+      </w:r>
+      <w:proofErr w:type="spellStart"/>
+      <w:r>
+        <w:rPr>
+          <w:sz w:val="18"/>
+          <w:szCs w:val="18"/>
+          <w:lang w:val="fr-CA"/>
+        </w:rPr>
+        <w:t>Volarus</w:t>
+      </w:r>
+      <w:proofErr w:type="spellEnd"/>
+      <w:r>
+        <w:rPr>
+          <w:sz w:val="18"/>
+          <w:szCs w:val="18"/>
+          <w:lang w:val="fr-CA"/>
+        </w:rPr>
+        <w:t xml:space="preserve"> de mieux informer ses clients et de les aider à anticiper les retards de leurs vols.</w:t>
       </w:r>
     </w:p>
     <w:p>
@@ -5440,7 +5984,25 @@
           <w:szCs w:val="18"/>
           <w:lang w:val="fr-CA"/>
         </w:rPr>
-        <w:t>Actuellement, certains vols sont en retard et Volarus souhaite pouvoir anticiper ces problèmes, mieux gérer les retards et informer les clients plus rapidement.</w:t>
+        <w:t xml:space="preserve">Actuellement, certains vols sont en retard et </w:t>
+      </w:r>
+      <w:proofErr w:type="spellStart"/>
+      <w:r>
+        <w:rPr>
+          <w:sz w:val="18"/>
+          <w:szCs w:val="18"/>
+          <w:lang w:val="fr-CA"/>
+        </w:rPr>
+        <w:t>Volarus</w:t>
+      </w:r>
+      <w:proofErr w:type="spellEnd"/>
+      <w:r>
+        <w:rPr>
+          <w:sz w:val="18"/>
+          <w:szCs w:val="18"/>
+          <w:lang w:val="fr-CA"/>
+        </w:rPr>
+        <w:t xml:space="preserve"> souhaite pouvoir anticiper ces problèmes, mieux gérer les retards et informer les clients plus rapidement.</w:t>
       </w:r>
     </w:p>
     <w:p>
@@ -5452,13 +6014,23 @@
           <w:lang w:val="fr-CA"/>
         </w:rPr>
       </w:pPr>
+      <w:proofErr w:type="spellStart"/>
       <w:r>
         <w:rPr>
           <w:sz w:val="18"/>
           <w:szCs w:val="18"/>
           <w:lang w:val="fr-CA"/>
         </w:rPr>
-        <w:t>Volarus a de la difficulté à savoir quels vols seront en retard et de combien de temps.</w:t>
+        <w:t>Volarus</w:t>
+      </w:r>
+      <w:proofErr w:type="spellEnd"/>
+      <w:r>
+        <w:rPr>
+          <w:sz w:val="18"/>
+          <w:szCs w:val="18"/>
+          <w:lang w:val="fr-CA"/>
+        </w:rPr>
+        <w:t xml:space="preserve"> a de la difficulté à savoir quels vols seront en retard et de combien de temps.</w:t>
       </w:r>
     </w:p>
     <w:p>
@@ -5658,13 +6230,23 @@
           <w:lang w:val="fr-CA"/>
         </w:rPr>
       </w:pPr>
+      <w:proofErr w:type="spellStart"/>
       <w:r>
         <w:rPr>
           <w:sz w:val="18"/>
           <w:szCs w:val="18"/>
           <w:lang w:val="fr-CA"/>
         </w:rPr>
-        <w:t>Volarus ne peut pas savoir si un vol sera en retard ou non et, s’il est en retard, l’entreprise ne peut pas savoir de combien de temps.</w:t>
+        <w:t>Volarus</w:t>
+      </w:r>
+      <w:proofErr w:type="spellEnd"/>
+      <w:r>
+        <w:rPr>
+          <w:sz w:val="18"/>
+          <w:szCs w:val="18"/>
+          <w:lang w:val="fr-CA"/>
+        </w:rPr>
+        <w:t xml:space="preserve"> ne peut pas savoir si un vol sera en retard ou non et, s’il est en retard, l’entreprise ne peut pas savoir de combien de temps.</w:t>
       </w:r>
     </w:p>
     <w:p>
@@ -5850,7 +6432,23 @@
         <w:rPr>
           <w:lang w:val="fr-CA"/>
         </w:rPr>
-        <w:t xml:space="preserve">Nous nous attendons a prédire </w:t>
+        <w:t xml:space="preserve">Nous nous attendons </w:t>
+      </w:r>
+      <w:proofErr w:type="spellStart"/>
+      <w:proofErr w:type="gramStart"/>
+      <w:r>
+        <w:rPr>
+          <w:lang w:val="fr-CA"/>
+        </w:rPr>
+        <w:t>a</w:t>
+      </w:r>
+      <w:proofErr w:type="spellEnd"/>
+      <w:proofErr w:type="gramEnd"/>
+      <w:r>
+        <w:rPr>
+          <w:lang w:val="fr-CA"/>
+        </w:rPr>
+        <w:t xml:space="preserve"> prédire </w:t>
       </w:r>
       <w:r>
         <w:rPr>
@@ -5982,6 +6580,7 @@
                 <w:szCs w:val="20"/>
               </w:rPr>
             </w:pPr>
+            <w:proofErr w:type="spellStart"/>
             <w:r>
               <w:rPr>
                 <w:b/>
@@ -5991,6 +6590,7 @@
               </w:rPr>
               <w:t>Indicateur</w:t>
             </w:r>
+            <w:proofErr w:type="spellEnd"/>
           </w:p>
         </w:tc>
         <w:tc>
@@ -6015,6 +6615,7 @@
                 <w:szCs w:val="20"/>
               </w:rPr>
             </w:pPr>
+            <w:proofErr w:type="spellStart"/>
             <w:r>
               <w:rPr>
                 <w:b/>
@@ -6022,8 +6623,29 @@
                 <w:sz w:val="20"/>
                 <w:szCs w:val="20"/>
               </w:rPr>
-              <w:t>Pourquoi est-il pertinent ?</w:t>
-            </w:r>
+              <w:t>Pourquoi</w:t>
+            </w:r>
+            <w:proofErr w:type="spellEnd"/>
+            <w:r>
+              <w:rPr>
+                <w:b/>
+                <w:bCs/>
+                <w:sz w:val="20"/>
+                <w:szCs w:val="20"/>
+              </w:rPr>
+              <w:t xml:space="preserve"> est-il </w:t>
+            </w:r>
+            <w:proofErr w:type="gramStart"/>
+            <w:r>
+              <w:rPr>
+                <w:b/>
+                <w:bCs/>
+                <w:sz w:val="20"/>
+                <w:szCs w:val="20"/>
+              </w:rPr>
+              <w:t>pertinent ?</w:t>
+            </w:r>
+            <w:proofErr w:type="gramEnd"/>
           </w:p>
         </w:tc>
       </w:tr>
@@ -6375,9 +6997,22 @@
       </w:pPr>
       <w:bookmarkStart w:id="10" w:name="_Toc1179740364"/>
       <w:r>
-        <w:t>2. Périmètre du projet</w:t>
+        <w:t xml:space="preserve">2. </w:t>
+      </w:r>
+      <w:proofErr w:type="spellStart"/>
+      <w:r>
+        <w:t>Périmètre</w:t>
+      </w:r>
+      <w:proofErr w:type="spellEnd"/>
+      <w:r>
+        <w:t xml:space="preserve"> du </w:t>
+      </w:r>
+      <w:proofErr w:type="spellStart"/>
+      <w:r>
+        <w:t>projet</w:t>
       </w:r>
       <w:bookmarkEnd w:id="10"/>
+      <w:proofErr w:type="spellEnd"/>
     </w:p>
     <w:tbl>
       <w:tblPr>
@@ -6941,9 +7576,9 @@
         <w:tblLook w:val="04A0" w:firstRow="1" w:lastRow="0" w:firstColumn="1" w:lastColumn="0" w:noHBand="0" w:noVBand="1"/>
       </w:tblPr>
       <w:tblGrid>
-        <w:gridCol w:w="2979"/>
-        <w:gridCol w:w="3187"/>
-        <w:gridCol w:w="3184"/>
+        <w:gridCol w:w="3002"/>
+        <w:gridCol w:w="3199"/>
+        <w:gridCol w:w="3149"/>
       </w:tblGrid>
       <w:tr>
         <w:trPr>
@@ -6980,7 +7615,6 @@
                 <w:sz w:val="20"/>
                 <w:szCs w:val="20"/>
               </w:rPr>
-              <w:lastRenderedPageBreak/>
               <w:t>Membre</w:t>
             </w:r>
           </w:p>
@@ -7007,6 +7641,7 @@
                 <w:szCs w:val="20"/>
               </w:rPr>
             </w:pPr>
+            <w:proofErr w:type="spellStart"/>
             <w:r>
               <w:rPr>
                 <w:b/>
@@ -7014,32 +7649,19 @@
                 <w:sz w:val="20"/>
                 <w:szCs w:val="20"/>
               </w:rPr>
-              <w:t>Responsabilités prévues</w:t>
-            </w:r>
-          </w:p>
-        </w:tc>
-        <w:tc>
-          <w:tcPr>
-            <w:tcW w:w="3408" w:type="dxa"/>
-            <w:shd w:val="clear" w:color="auto" w:fill="D9EAF7"/>
-            <w:tcMar>
-              <w:top w:w="100" w:type="dxa"/>
-              <w:left w:w="100" w:type="dxa"/>
-              <w:bottom w:w="100" w:type="dxa"/>
-              <w:right w:w="100" w:type="dxa"/>
-            </w:tcMar>
-            <w:vAlign w:val="center"/>
-          </w:tcPr>
-          <w:p>
-            <w:pPr>
-              <w:jc w:val="center"/>
+              <w:t>Responsabilités</w:t>
+            </w:r>
+            <w:proofErr w:type="spellEnd"/>
+            <w:r>
               <w:rPr>
                 <w:b/>
                 <w:bCs/>
                 <w:sz w:val="20"/>
                 <w:szCs w:val="20"/>
               </w:rPr>
-            </w:pPr>
+              <w:t xml:space="preserve"> </w:t>
+            </w:r>
+            <w:proofErr w:type="spellStart"/>
             <w:r>
               <w:rPr>
                 <w:b/>
@@ -7047,8 +7669,53 @@
                 <w:sz w:val="20"/>
                 <w:szCs w:val="20"/>
               </w:rPr>
-              <w:t>Contribution principale</w:t>
-            </w:r>
+              <w:t>prévues</w:t>
+            </w:r>
+            <w:proofErr w:type="spellEnd"/>
+          </w:p>
+        </w:tc>
+        <w:tc>
+          <w:tcPr>
+            <w:tcW w:w="3408" w:type="dxa"/>
+            <w:shd w:val="clear" w:color="auto" w:fill="D9EAF7"/>
+            <w:tcMar>
+              <w:top w:w="100" w:type="dxa"/>
+              <w:left w:w="100" w:type="dxa"/>
+              <w:bottom w:w="100" w:type="dxa"/>
+              <w:right w:w="100" w:type="dxa"/>
+            </w:tcMar>
+            <w:vAlign w:val="center"/>
+          </w:tcPr>
+          <w:p>
+            <w:pPr>
+              <w:jc w:val="center"/>
+              <w:rPr>
+                <w:b/>
+                <w:bCs/>
+                <w:sz w:val="20"/>
+                <w:szCs w:val="20"/>
+              </w:rPr>
+            </w:pPr>
+            <w:r>
+              <w:rPr>
+                <w:b/>
+                <w:bCs/>
+                <w:sz w:val="20"/>
+                <w:szCs w:val="20"/>
+              </w:rPr>
+              <w:t xml:space="preserve">Contribution </w:t>
+            </w:r>
+            <w:proofErr w:type="spellStart"/>
+            <w:r>
+              <w:rPr>
+                <w:b/>
+                <w:bCs/>
+                <w:sz w:val="20"/>
+                <w:szCs w:val="20"/>
+              </w:rPr>
+              <w:t>principale</w:t>
+            </w:r>
+            <w:proofErr w:type="spellEnd"/>
           </w:p>
         </w:tc>
       </w:tr>
@@ -7102,6 +7769,7 @@
           </w:tcPr>
           <w:p>
             <w:pPr>
+              <w:ind w:left="720"/>
               <w:rPr>
                 <w:sz w:val="18"/>
                 <w:szCs w:val="18"/>
@@ -7114,72 +7782,22 @@
                 <w:szCs w:val="18"/>
                 <w:lang w:val="fr-CA"/>
               </w:rPr>
-              <w:t>Nous allons avoir les mêmes responsabilités, puisque nous allons faire le projet 100 % ensemble, en réunion ou en appel.</w:t>
-            </w:r>
-          </w:p>
+              <w:t>Recherche de modèles; développement et entraînement des modèles d’IA; optimisation; évaluation des performances.</w:t>
+            </w:r>
+          </w:p>
+        </w:tc>
+        <w:tc>
+          <w:tcPr>
+            <w:tcW w:w="3408" w:type="dxa"/>
+            <w:tcMar>
+              <w:top w:w="100" w:type="dxa"/>
+              <w:left w:w="100" w:type="dxa"/>
+              <w:bottom w:w="100" w:type="dxa"/>
+              <w:right w:w="100" w:type="dxa"/>
+            </w:tcMar>
+          </w:tcPr>
           <w:p>
             <w:pPr>
-              <w:numPr>
-                <w:ilvl w:val="0"/>
-                <w:numId w:val="16"/>
-              </w:numPr>
-              <w:rPr>
-                <w:sz w:val="18"/>
-                <w:szCs w:val="18"/>
-              </w:rPr>
-            </w:pPr>
-            <w:r>
-              <w:rPr>
-                <w:sz w:val="18"/>
-                <w:szCs w:val="18"/>
-              </w:rPr>
-              <w:t xml:space="preserve">Recherche et préparation des données </w:t>
-            </w:r>
-          </w:p>
-          <w:p>
-            <w:pPr>
-              <w:numPr>
-                <w:ilvl w:val="0"/>
-                <w:numId w:val="16"/>
-              </w:numPr>
-              <w:rPr>
-                <w:sz w:val="18"/>
-                <w:szCs w:val="18"/>
-              </w:rPr>
-            </w:pPr>
-            <w:r>
-              <w:rPr>
-                <w:sz w:val="18"/>
-                <w:szCs w:val="18"/>
-              </w:rPr>
-              <w:t xml:space="preserve">Nettoyage des données </w:t>
-            </w:r>
-          </w:p>
-          <w:p>
-            <w:pPr>
-              <w:numPr>
-                <w:ilvl w:val="0"/>
-                <w:numId w:val="16"/>
-              </w:numPr>
-              <w:rPr>
-                <w:sz w:val="18"/>
-                <w:szCs w:val="18"/>
-              </w:rPr>
-            </w:pPr>
-            <w:r>
-              <w:rPr>
-                <w:sz w:val="18"/>
-                <w:szCs w:val="18"/>
-              </w:rPr>
-              <w:t xml:space="preserve">Exploration et visualisation des données </w:t>
-            </w:r>
-          </w:p>
-          <w:p>
-            <w:pPr>
-              <w:numPr>
-                <w:ilvl w:val="0"/>
-                <w:numId w:val="16"/>
-              </w:numPr>
               <w:rPr>
                 <w:sz w:val="18"/>
                 <w:szCs w:val="18"/>
@@ -7192,178 +7810,25 @@
                 <w:szCs w:val="18"/>
                 <w:lang w:val="fr-CA"/>
               </w:rPr>
-              <w:t xml:space="preserve">Participation au développement et aux tests des modèles d’IA </w:t>
+              <w:t xml:space="preserve"> </w:t>
             </w:r>
           </w:p>
           <w:p>
             <w:pPr>
-              <w:numPr>
-                <w:ilvl w:val="0"/>
-                <w:numId w:val="16"/>
-              </w:numPr>
+              <w:rPr>
+                <w:sz w:val="20"/>
+                <w:szCs w:val="20"/>
+                <w:lang w:val="fr-CA"/>
+              </w:rPr>
+            </w:pPr>
+            <w:r>
               <w:rPr>
                 <w:sz w:val="18"/>
                 <w:szCs w:val="18"/>
                 <w:lang w:val="fr-CA"/>
               </w:rPr>
-            </w:pPr>
-            <w:r>
-              <w:rPr>
-                <w:sz w:val="18"/>
-                <w:szCs w:val="18"/>
-                <w:lang w:val="fr-CA"/>
-              </w:rPr>
-              <w:t xml:space="preserve">Participation à l’évaluation des modèles d’IA </w:t>
-            </w:r>
-          </w:p>
-          <w:p>
-            <w:pPr>
-              <w:numPr>
-                <w:ilvl w:val="0"/>
-                <w:numId w:val="16"/>
-              </w:numPr>
-              <w:rPr>
-                <w:sz w:val="18"/>
-                <w:szCs w:val="18"/>
-              </w:rPr>
-            </w:pPr>
-            <w:r>
-              <w:rPr>
-                <w:sz w:val="18"/>
-                <w:szCs w:val="18"/>
-              </w:rPr>
-              <w:t>Documentation du projet</w:t>
-            </w:r>
-          </w:p>
-          <w:p>
-            <w:pPr>
-              <w:rPr>
-                <w:sz w:val="18"/>
-                <w:szCs w:val="18"/>
-                <w:lang w:val="fr-CA"/>
-              </w:rPr>
-            </w:pPr>
-          </w:p>
-        </w:tc>
-        <w:tc>
-          <w:tcPr>
-            <w:tcW w:w="3408" w:type="dxa"/>
-            <w:tcMar>
-              <w:top w:w="100" w:type="dxa"/>
-              <w:left w:w="100" w:type="dxa"/>
-              <w:bottom w:w="100" w:type="dxa"/>
-              <w:right w:w="100" w:type="dxa"/>
-            </w:tcMar>
-          </w:tcPr>
-          <w:p>
-            <w:pPr>
-              <w:rPr>
-                <w:sz w:val="18"/>
-                <w:szCs w:val="18"/>
-                <w:lang w:val="fr-CA"/>
-              </w:rPr>
-            </w:pPr>
-            <w:r>
-              <w:rPr>
-                <w:sz w:val="18"/>
-                <w:szCs w:val="18"/>
-                <w:lang w:val="fr-CA"/>
-              </w:rPr>
-              <w:t xml:space="preserve"> </w:t>
-            </w:r>
-            <w:r>
-              <w:rPr>
-                <w:sz w:val="18"/>
-                <w:szCs w:val="18"/>
-                <w:lang w:val="fr-CA"/>
-              </w:rPr>
-              <w:t>Nous faisons les mêmes contributions, puisque nous allons faire le projet 100 % ensemble, en réunion ou en appel.</w:t>
-            </w:r>
-          </w:p>
-          <w:p>
-            <w:pPr>
-              <w:numPr>
-                <w:ilvl w:val="0"/>
-                <w:numId w:val="19"/>
-              </w:numPr>
-              <w:rPr>
-                <w:sz w:val="18"/>
-                <w:szCs w:val="18"/>
-              </w:rPr>
-            </w:pPr>
-            <w:r>
-              <w:rPr>
-                <w:sz w:val="18"/>
-                <w:szCs w:val="18"/>
-              </w:rPr>
-              <w:t xml:space="preserve">Préparation et analyse des données </w:t>
-            </w:r>
-          </w:p>
-          <w:p>
-            <w:pPr>
-              <w:numPr>
-                <w:ilvl w:val="0"/>
-                <w:numId w:val="19"/>
-              </w:numPr>
-              <w:rPr>
-                <w:sz w:val="18"/>
-                <w:szCs w:val="18"/>
-              </w:rPr>
-            </w:pPr>
-            <w:r>
-              <w:rPr>
-                <w:sz w:val="18"/>
-                <w:szCs w:val="18"/>
-              </w:rPr>
-              <w:t xml:space="preserve">Modélisation </w:t>
-            </w:r>
-          </w:p>
-          <w:p>
-            <w:pPr>
-              <w:numPr>
-                <w:ilvl w:val="0"/>
-                <w:numId w:val="19"/>
-              </w:numPr>
-              <w:rPr>
-                <w:sz w:val="18"/>
-                <w:szCs w:val="18"/>
-              </w:rPr>
-            </w:pPr>
-            <w:r>
-              <w:rPr>
-                <w:sz w:val="18"/>
-                <w:szCs w:val="18"/>
-              </w:rPr>
-              <w:t xml:space="preserve">Évaluation des modèles </w:t>
-            </w:r>
-          </w:p>
-          <w:p>
-            <w:pPr>
-              <w:numPr>
-                <w:ilvl w:val="0"/>
-                <w:numId w:val="19"/>
-              </w:numPr>
-              <w:rPr>
-                <w:sz w:val="18"/>
-                <w:szCs w:val="18"/>
-              </w:rPr>
-            </w:pPr>
-            <w:r>
-              <w:rPr>
-                <w:sz w:val="18"/>
-                <w:szCs w:val="18"/>
-              </w:rPr>
-              <w:t xml:space="preserve">Documentation du projet </w:t>
-            </w:r>
-          </w:p>
-          <w:p>
-            <w:pPr>
-              <w:rPr>
-                <w:sz w:val="20"/>
-                <w:szCs w:val="20"/>
-                <w:lang w:val="fr-CA"/>
-              </w:rPr>
-            </w:pPr>
+              <w:t>Modélisation, optimisation et comparaison des modèles; analyse des métriques et des résultats.</w:t>
+            </w:r>
           </w:p>
         </w:tc>
       </w:tr>
@@ -7395,6 +7860,7 @@
                 <w:szCs w:val="20"/>
                 <w:lang w:val="fr-CA"/>
               </w:rPr>
+              <w:lastRenderedPageBreak/>
               <w:t xml:space="preserve"> </w:t>
             </w:r>
             <w:r>
@@ -7418,11 +7884,6 @@
           </w:tcPr>
           <w:p>
             <w:pPr>
-              <w:pStyle w:val="Paragraphedeliste"/>
-              <w:numPr>
-                <w:ilvl w:val="0"/>
-                <w:numId w:val="18"/>
-              </w:numPr>
               <w:rPr>
                 <w:sz w:val="18"/>
                 <w:szCs w:val="18"/>
@@ -7435,221 +7896,118 @@
                 <w:szCs w:val="18"/>
                 <w:lang w:val="fr-CA"/>
               </w:rPr>
-              <w:t xml:space="preserve">Recherche et préparation des données </w:t>
+              <w:t>Recherche et exploration des données; nettoyage et transformation; analyse des variables; documentation du projet.</w:t>
             </w:r>
           </w:p>
           <w:p>
             <w:pPr>
-              <w:numPr>
-                <w:ilvl w:val="0"/>
-                <w:numId w:val="17"/>
-              </w:numPr>
-              <w:rPr>
-                <w:sz w:val="18"/>
-                <w:szCs w:val="18"/>
+              <w:rPr>
+                <w:sz w:val="20"/>
+                <w:szCs w:val="20"/>
+                <w:lang w:val="fr-CA"/>
               </w:rPr>
             </w:pPr>
-            <w:r>
-              <w:rPr>
-                <w:sz w:val="18"/>
-                <w:szCs w:val="18"/>
-              </w:rPr>
-              <w:t xml:space="preserve">Nettoyage des données </w:t>
-            </w:r>
-          </w:p>
+          </w:p>
+        </w:tc>
+        <w:tc>
+          <w:tcPr>
+            <w:tcW w:w="3408" w:type="dxa"/>
+            <w:tcMar>
+              <w:top w:w="100" w:type="dxa"/>
+              <w:left w:w="100" w:type="dxa"/>
+              <w:bottom w:w="100" w:type="dxa"/>
+              <w:right w:w="100" w:type="dxa"/>
+            </w:tcMar>
+          </w:tcPr>
           <w:p>
             <w:pPr>
-              <w:numPr>
-                <w:ilvl w:val="0"/>
-                <w:numId w:val="17"/>
-              </w:numPr>
-              <w:rPr>
-                <w:sz w:val="18"/>
-                <w:szCs w:val="18"/>
-              </w:rPr>
-            </w:pPr>
-            <w:r>
-              <w:rPr>
-                <w:sz w:val="18"/>
-                <w:szCs w:val="18"/>
-              </w:rPr>
-              <w:t xml:space="preserve">Exploration et visualisation des données </w:t>
-            </w:r>
-          </w:p>
-          <w:p>
-            <w:pPr>
-              <w:numPr>
-                <w:ilvl w:val="0"/>
-                <w:numId w:val="17"/>
-              </w:numPr>
+              <w:ind w:left="720"/>
               <w:rPr>
                 <w:sz w:val="18"/>
                 <w:szCs w:val="18"/>
                 <w:lang w:val="fr-CA"/>
               </w:rPr>
             </w:pPr>
+            <w:proofErr w:type="spellStart"/>
             <w:r>
               <w:rPr>
                 <w:sz w:val="18"/>
                 <w:szCs w:val="18"/>
-                <w:lang w:val="fr-CA"/>
-              </w:rPr>
-              <w:t xml:space="preserve">Participation au développement et aux tests des modèles d’IA </w:t>
-            </w:r>
-          </w:p>
-          <w:p>
-            <w:pPr>
-              <w:numPr>
-                <w:ilvl w:val="0"/>
-                <w:numId w:val="17"/>
-              </w:numPr>
+              </w:rPr>
+              <w:t>Préparation</w:t>
+            </w:r>
+            <w:proofErr w:type="spellEnd"/>
+            <w:r>
               <w:rPr>
                 <w:sz w:val="18"/>
                 <w:szCs w:val="18"/>
-                <w:lang w:val="fr-CA"/>
-              </w:rPr>
-            </w:pPr>
+              </w:rPr>
+              <w:t xml:space="preserve"> et </w:t>
+            </w:r>
+            <w:proofErr w:type="spellStart"/>
             <w:r>
               <w:rPr>
                 <w:sz w:val="18"/>
                 <w:szCs w:val="18"/>
-                <w:lang w:val="fr-CA"/>
-              </w:rPr>
-              <w:t xml:space="preserve">Participation à l’évaluation des modèles d’IA </w:t>
-            </w:r>
-          </w:p>
-          <w:p>
-            <w:pPr>
-              <w:numPr>
-                <w:ilvl w:val="0"/>
-                <w:numId w:val="17"/>
-              </w:numPr>
+              </w:rPr>
+              <w:t>analyse</w:t>
+            </w:r>
+            <w:proofErr w:type="spellEnd"/>
+            <w:r>
               <w:rPr>
                 <w:sz w:val="18"/>
                 <w:szCs w:val="18"/>
               </w:rPr>
-            </w:pPr>
+              <w:t xml:space="preserve"> des données; </w:t>
+            </w:r>
+            <w:proofErr w:type="spellStart"/>
             <w:r>
               <w:rPr>
                 <w:sz w:val="18"/>
                 <w:szCs w:val="18"/>
               </w:rPr>
-              <w:t>Documentation du projet</w:t>
-            </w:r>
-          </w:p>
-          <w:p>
-            <w:pPr>
+              <w:t>création</w:t>
+            </w:r>
+            <w:proofErr w:type="spellEnd"/>
+            <w:r>
               <w:rPr>
                 <w:sz w:val="18"/>
                 <w:szCs w:val="18"/>
-                <w:lang w:val="fr-CA"/>
-              </w:rPr>
-            </w:pPr>
-          </w:p>
-          <w:p>
-            <w:pPr>
-              <w:rPr>
-                <w:sz w:val="20"/>
-                <w:szCs w:val="20"/>
-                <w:lang w:val="fr-CA"/>
-              </w:rPr>
-            </w:pPr>
-          </w:p>
-        </w:tc>
-        <w:tc>
-          <w:tcPr>
-            <w:tcW w:w="3408" w:type="dxa"/>
-            <w:tcMar>
-              <w:top w:w="100" w:type="dxa"/>
-              <w:left w:w="100" w:type="dxa"/>
-              <w:bottom w:w="100" w:type="dxa"/>
-              <w:right w:w="100" w:type="dxa"/>
-            </w:tcMar>
-          </w:tcPr>
-          <w:p>
-            <w:pPr>
-              <w:numPr>
-                <w:ilvl w:val="0"/>
-                <w:numId w:val="19"/>
-              </w:numPr>
+              </w:rPr>
+              <w:t xml:space="preserve"> du </w:t>
+            </w:r>
+            <w:proofErr w:type="spellStart"/>
+            <w:r>
               <w:rPr>
                 <w:sz w:val="18"/>
                 <w:szCs w:val="18"/>
               </w:rPr>
-            </w:pPr>
+              <w:t>dictionnaire</w:t>
+            </w:r>
+            <w:proofErr w:type="spellEnd"/>
             <w:r>
               <w:rPr>
                 <w:sz w:val="18"/>
                 <w:szCs w:val="18"/>
               </w:rPr>
-              <w:t xml:space="preserve">Préparation et analyse des données </w:t>
-            </w:r>
-          </w:p>
-          <w:p>
-            <w:pPr>
-              <w:numPr>
-                <w:ilvl w:val="0"/>
-                <w:numId w:val="19"/>
-              </w:numPr>
+              <w:t xml:space="preserve"> de données; </w:t>
+            </w:r>
+            <w:proofErr w:type="spellStart"/>
+            <w:r>
               <w:rPr>
                 <w:sz w:val="18"/>
                 <w:szCs w:val="18"/>
               </w:rPr>
-            </w:pPr>
+              <w:t>suivi</w:t>
+            </w:r>
+            <w:proofErr w:type="spellEnd"/>
             <w:r>
               <w:rPr>
                 <w:sz w:val="18"/>
                 <w:szCs w:val="18"/>
               </w:rPr>
-              <w:t xml:space="preserve">Modélisation </w:t>
-            </w:r>
-          </w:p>
-          <w:p>
-            <w:pPr>
-              <w:numPr>
-                <w:ilvl w:val="0"/>
-                <w:numId w:val="19"/>
-              </w:numPr>
-              <w:rPr>
-                <w:sz w:val="18"/>
-                <w:szCs w:val="18"/>
-              </w:rPr>
-            </w:pPr>
-            <w:r>
-              <w:rPr>
-                <w:sz w:val="18"/>
-                <w:szCs w:val="18"/>
-              </w:rPr>
-              <w:t xml:space="preserve">Évaluation des modèles </w:t>
-            </w:r>
-          </w:p>
-          <w:p>
-            <w:pPr>
-              <w:numPr>
-                <w:ilvl w:val="0"/>
-                <w:numId w:val="19"/>
-              </w:numPr>
-              <w:rPr>
-                <w:sz w:val="18"/>
-                <w:szCs w:val="18"/>
-              </w:rPr>
-            </w:pPr>
-            <w:r>
-              <w:rPr>
-                <w:sz w:val="18"/>
-                <w:szCs w:val="18"/>
-              </w:rPr>
-              <w:t xml:space="preserve">Documentation du projet </w:t>
-            </w:r>
-          </w:p>
-          <w:p>
-            <w:pPr>
-              <w:rPr>
-                <w:sz w:val="18"/>
-                <w:szCs w:val="18"/>
-                <w:lang w:val="fr-CA"/>
-              </w:rPr>
-            </w:pPr>
+              <w:t xml:space="preserve"> du cahier de charges.</w:t>
+            </w:r>
           </w:p>
         </w:tc>
       </w:tr>
@@ -8133,8 +8491,19 @@
                 <w:sz w:val="20"/>
                 <w:szCs w:val="20"/>
               </w:rPr>
-              <w:t>Auteur / organisation</w:t>
-            </w:r>
+              <w:t xml:space="preserve">Auteur / </w:t>
+            </w:r>
+            <w:proofErr w:type="spellStart"/>
+            <w:r>
+              <w:rPr>
+                <w:b/>
+                <w:bCs/>
+                <w:sz w:val="20"/>
+                <w:szCs w:val="20"/>
+              </w:rPr>
+              <w:t>organisation</w:t>
+            </w:r>
+            <w:proofErr w:type="spellEnd"/>
           </w:p>
         </w:tc>
         <w:tc>
@@ -8238,7 +8607,25 @@
                 <w:szCs w:val="20"/>
                 <w:lang w:val="fr-CA"/>
               </w:rPr>
-              <w:t>(lien dans la source, no</w:t>
+              <w:t>(</w:t>
+            </w:r>
+            <w:proofErr w:type="gramStart"/>
+            <w:r>
+              <w:rPr>
+                <w:sz w:val="20"/>
+                <w:szCs w:val="20"/>
+                <w:lang w:val="fr-CA"/>
+              </w:rPr>
+              <w:t>lien</w:t>
+            </w:r>
+            <w:proofErr w:type="gramEnd"/>
+            <w:r>
+              <w:rPr>
+                <w:sz w:val="20"/>
+                <w:szCs w:val="20"/>
+                <w:lang w:val="fr-CA"/>
+              </w:rPr>
+              <w:t xml:space="preserve"> dans la source, no</w:t>
             </w:r>
             <w:r>
               <w:rPr>
@@ -8351,32 +8738,63 @@
                 <w:sz w:val="20"/>
                 <w:szCs w:val="20"/>
               </w:rPr>
-              <w:t>Conditions d’utilisation / accès</w:t>
-            </w:r>
-          </w:p>
-        </w:tc>
-        <w:tc>
-          <w:tcPr>
-            <w:tcW w:w="5810" w:type="dxa"/>
-            <w:tcMar>
-              <w:top w:w="100" w:type="dxa"/>
-              <w:left w:w="100" w:type="dxa"/>
-              <w:bottom w:w="100" w:type="dxa"/>
-              <w:right w:w="100" w:type="dxa"/>
-            </w:tcMar>
-          </w:tcPr>
-          <w:p>
-            <w:pPr>
-              <w:rPr>
+              <w:t xml:space="preserve">Conditions </w:t>
+            </w:r>
+            <w:proofErr w:type="spellStart"/>
+            <w:r>
+              <w:rPr>
+                <w:b/>
+                <w:bCs/>
                 <w:sz w:val="20"/>
                 <w:szCs w:val="20"/>
               </w:rPr>
-            </w:pPr>
-            <w:r>
-              <w:rPr>
+              <w:t>d’utilisation</w:t>
+            </w:r>
+            <w:proofErr w:type="spellEnd"/>
+            <w:r>
+              <w:rPr>
+                <w:b/>
+                <w:bCs/>
                 <w:sz w:val="20"/>
                 <w:szCs w:val="20"/>
               </w:rPr>
+              <w:t xml:space="preserve"> / </w:t>
+            </w:r>
+            <w:proofErr w:type="spellStart"/>
+            <w:r>
+              <w:rPr>
+                <w:b/>
+                <w:bCs/>
+                <w:sz w:val="20"/>
+                <w:szCs w:val="20"/>
+              </w:rPr>
+              <w:t>accès</w:t>
+            </w:r>
+            <w:proofErr w:type="spellEnd"/>
+          </w:p>
+        </w:tc>
+        <w:tc>
+          <w:tcPr>
+            <w:tcW w:w="5810" w:type="dxa"/>
+            <w:tcMar>
+              <w:top w:w="100" w:type="dxa"/>
+              <w:left w:w="100" w:type="dxa"/>
+              <w:bottom w:w="100" w:type="dxa"/>
+              <w:right w:w="100" w:type="dxa"/>
+            </w:tcMar>
+          </w:tcPr>
+          <w:p>
+            <w:pPr>
+              <w:rPr>
+                <w:sz w:val="20"/>
+                <w:szCs w:val="20"/>
+              </w:rPr>
+            </w:pPr>
+            <w:r>
+              <w:rPr>
+                <w:sz w:val="20"/>
+                <w:szCs w:val="20"/>
+              </w:rPr>
               <w:t xml:space="preserve"> </w:t>
             </w:r>
             <w:r>
@@ -8384,8 +8802,17 @@
                 <w:sz w:val="18"/>
                 <w:szCs w:val="18"/>
               </w:rPr>
-              <w:t>Données publique et gratuite</w:t>
-            </w:r>
+              <w:t xml:space="preserve">Données publique et </w:t>
+            </w:r>
+            <w:proofErr w:type="spellStart"/>
+            <w:r>
+              <w:rPr>
+                <w:sz w:val="18"/>
+                <w:szCs w:val="18"/>
+              </w:rPr>
+              <w:t>gratuite</w:t>
+            </w:r>
+            <w:proofErr w:type="spellEnd"/>
           </w:p>
         </w:tc>
       </w:tr>
@@ -8661,8 +9088,19 @@
                 <w:sz w:val="20"/>
                 <w:szCs w:val="20"/>
               </w:rPr>
-              <w:t>Auteur / organisation</w:t>
-            </w:r>
+              <w:t xml:space="preserve">Auteur / </w:t>
+            </w:r>
+            <w:proofErr w:type="spellStart"/>
+            <w:r>
+              <w:rPr>
+                <w:b/>
+                <w:bCs/>
+                <w:sz w:val="20"/>
+                <w:szCs w:val="20"/>
+              </w:rPr>
+              <w:t>organisation</w:t>
+            </w:r>
+            <w:proofErr w:type="spellEnd"/>
           </w:p>
         </w:tc>
         <w:tc>
@@ -8895,8 +9333,39 @@
                 <w:sz w:val="20"/>
                 <w:szCs w:val="20"/>
               </w:rPr>
-              <w:t>Conditions d’utilisation / accès</w:t>
-            </w:r>
+              <w:t xml:space="preserve">Conditions </w:t>
+            </w:r>
+            <w:proofErr w:type="spellStart"/>
+            <w:r>
+              <w:rPr>
+                <w:b/>
+                <w:bCs/>
+                <w:sz w:val="20"/>
+                <w:szCs w:val="20"/>
+              </w:rPr>
+              <w:t>d’utilisation</w:t>
+            </w:r>
+            <w:proofErr w:type="spellEnd"/>
+            <w:r>
+              <w:rPr>
+                <w:b/>
+                <w:bCs/>
+                <w:sz w:val="20"/>
+                <w:szCs w:val="20"/>
+              </w:rPr>
+              <w:t xml:space="preserve"> / </w:t>
+            </w:r>
+            <w:proofErr w:type="spellStart"/>
+            <w:r>
+              <w:rPr>
+                <w:b/>
+                <w:bCs/>
+                <w:sz w:val="20"/>
+                <w:szCs w:val="20"/>
+              </w:rPr>
+              <w:t>accès</w:t>
+            </w:r>
+            <w:proofErr w:type="spellEnd"/>
           </w:p>
         </w:tc>
         <w:tc>
@@ -8946,7 +9415,15 @@
       <w:bookmarkStart w:id="17" w:name="_Toc1080090942"/>
       <w:r>
         <w:lastRenderedPageBreak/>
-        <w:t>4.2 Description générale des données</w:t>
+        <w:t xml:space="preserve">4.2 Description </w:t>
+      </w:r>
+      <w:proofErr w:type="spellStart"/>
+      <w:r>
+        <w:t>générale</w:t>
+      </w:r>
+      <w:proofErr w:type="spellEnd"/>
+      <w:r>
+        <w:t xml:space="preserve"> des données</w:t>
       </w:r>
       <w:bookmarkEnd w:id="17"/>
     </w:p>
@@ -9174,7 +9651,15 @@
       </w:pPr>
       <w:bookmarkStart w:id="20" w:name="_Toc43724186"/>
       <w:r>
-        <w:t>5.1 Principaux constats</w:t>
+        <w:t xml:space="preserve">5.1 </w:t>
+      </w:r>
+      <w:proofErr w:type="spellStart"/>
+      <w:r>
+        <w:t>Principaux</w:t>
+      </w:r>
+      <w:proofErr w:type="spellEnd"/>
+      <w:r>
+        <w:t xml:space="preserve"> constats</w:t>
       </w:r>
       <w:bookmarkEnd w:id="20"/>
     </w:p>
@@ -9950,23 +10435,59 @@
           <w:szCs w:val="18"/>
           <w:lang w:val="fr-CA"/>
         </w:rPr>
-        <w:t xml:space="preserve">- Vérifier que le dataset ne contient </w:t>
-      </w:r>
+        <w:t xml:space="preserve">- Vérifier que le </w:t>
+      </w:r>
+      <w:proofErr w:type="spellStart"/>
       <w:r>
         <w:rPr>
           <w:sz w:val="18"/>
           <w:szCs w:val="18"/>
           <w:lang w:val="fr-CA"/>
         </w:rPr>
-        <w:t>pas de</w:t>
-      </w:r>
+        <w:t>dataset</w:t>
+      </w:r>
+      <w:proofErr w:type="spellEnd"/>
       <w:r>
         <w:rPr>
           <w:sz w:val="18"/>
           <w:szCs w:val="18"/>
           <w:lang w:val="fr-CA"/>
         </w:rPr>
-        <w:t xml:space="preserve"> données qui peuvent faire du dataleak.</w:t>
+        <w:t xml:space="preserve"> ne contient </w:t>
+      </w:r>
+      <w:r>
+        <w:rPr>
+          <w:sz w:val="18"/>
+          <w:szCs w:val="18"/>
+          <w:lang w:val="fr-CA"/>
+        </w:rPr>
+        <w:t>pas de</w:t>
+      </w:r>
+      <w:r>
+        <w:rPr>
+          <w:sz w:val="18"/>
+          <w:szCs w:val="18"/>
+          <w:lang w:val="fr-CA"/>
+        </w:rPr>
+        <w:t xml:space="preserve"> données qui peuvent faire du </w:t>
+      </w:r>
+      <w:proofErr w:type="spellStart"/>
+      <w:r>
+        <w:rPr>
+          <w:sz w:val="18"/>
+          <w:szCs w:val="18"/>
+          <w:lang w:val="fr-CA"/>
+        </w:rPr>
+        <w:t>dataleak</w:t>
+      </w:r>
+      <w:proofErr w:type="spellEnd"/>
+      <w:r>
+        <w:rPr>
+          <w:sz w:val="18"/>
+          <w:szCs w:val="18"/>
+          <w:lang w:val="fr-CA"/>
+        </w:rPr>
+        <w:t>.</w:t>
       </w:r>
     </w:p>
     <w:p>
@@ -10215,6 +10736,7 @@
             <w:pPr>
               <w:jc w:val="center"/>
             </w:pPr>
+            <w:proofErr w:type="spellStart"/>
             <w:r>
               <w:rPr>
                 <w:b/>
@@ -10222,6 +10744,7 @@
               </w:rPr>
               <w:t>Exemple</w:t>
             </w:r>
+            <w:proofErr w:type="spellEnd"/>
           </w:p>
         </w:tc>
         <w:tc>
@@ -10240,13 +10763,24 @@
             <w:pPr>
               <w:jc w:val="center"/>
             </w:pPr>
+            <w:proofErr w:type="spellStart"/>
+            <w:proofErr w:type="gramStart"/>
             <w:r>
               <w:rPr>
                 <w:b/>
                 <w:sz w:val="19"/>
               </w:rPr>
-              <w:t>Utilisée ?</w:t>
-            </w:r>
+              <w:t>Utilisée</w:t>
+            </w:r>
+            <w:proofErr w:type="spellEnd"/>
+            <w:r>
+              <w:rPr>
+                <w:b/>
+                <w:sz w:val="19"/>
+              </w:rPr>
+              <w:t xml:space="preserve"> ?</w:t>
+            </w:r>
+            <w:proofErr w:type="gramEnd"/>
           </w:p>
         </w:tc>
       </w:tr>
@@ -10328,14 +10862,30 @@
               <w:rPr>
                 <w:sz w:val="19"/>
               </w:rPr>
-              <w:t xml:space="preserve">Ou l’avion est </w:t>
-            </w:r>
+              <w:t xml:space="preserve">Ou </w:t>
+            </w:r>
+            <w:proofErr w:type="spellStart"/>
+            <w:r>
+              <w:rPr>
+                <w:sz w:val="19"/>
+              </w:rPr>
+              <w:t>l’avion</w:t>
+            </w:r>
+            <w:proofErr w:type="spellEnd"/>
+            <w:r>
+              <w:rPr>
+                <w:sz w:val="19"/>
+              </w:rPr>
+              <w:t xml:space="preserve"> est </w:t>
+            </w:r>
+            <w:proofErr w:type="spellStart"/>
             <w:r>
               <w:rPr>
                 <w:sz w:val="19"/>
               </w:rPr>
               <w:t>partie</w:t>
             </w:r>
+            <w:proofErr w:type="spellEnd"/>
           </w:p>
         </w:tc>
         <w:tc>
@@ -10359,8 +10909,16 @@
               <w:rPr>
                 <w:sz w:val="19"/>
               </w:rPr>
-              <w:t>Los angeles</w:t>
-            </w:r>
+              <w:t xml:space="preserve">Los </w:t>
+            </w:r>
+            <w:proofErr w:type="spellStart"/>
+            <w:r>
+              <w:rPr>
+                <w:sz w:val="19"/>
+              </w:rPr>
+              <w:t>angeles</w:t>
+            </w:r>
+            <w:proofErr w:type="spellEnd"/>
           </w:p>
         </w:tc>
         <w:tc>
@@ -10465,7 +11023,21 @@
               <w:rPr>
                 <w:sz w:val="19"/>
               </w:rPr>
-              <w:t xml:space="preserve">Le mois </w:t>
+              <w:t xml:space="preserve">Le </w:t>
+            </w:r>
+            <w:proofErr w:type="spellStart"/>
+            <w:r>
+              <w:rPr>
+                <w:sz w:val="19"/>
+              </w:rPr>
+              <w:t>mois</w:t>
+            </w:r>
+            <w:proofErr w:type="spellEnd"/>
+            <w:r>
+              <w:rPr>
+                <w:sz w:val="19"/>
+              </w:rPr>
+              <w:t xml:space="preserve"> </w:t>
             </w:r>
           </w:p>
         </w:tc>
@@ -10720,6 +11292,7 @@
               </w:rPr>
               <w:t xml:space="preserve"> </w:t>
             </w:r>
+            <w:proofErr w:type="spellStart"/>
             <w:r>
               <w:rPr>
                 <w:sz w:val="19"/>
@@ -10727,6 +11300,7 @@
               </w:rPr>
               <w:t>Dest_city_name</w:t>
             </w:r>
+            <w:proofErr w:type="spellEnd"/>
           </w:p>
         </w:tc>
         <w:tc>
@@ -10752,6 +11326,8 @@
               </w:rPr>
               <w:t xml:space="preserve"> </w:t>
             </w:r>
+            <w:proofErr w:type="spellStart"/>
+            <w:proofErr w:type="gramStart"/>
             <w:r>
               <w:rPr>
                 <w:sz w:val="19"/>
@@ -10759,6 +11335,8 @@
               </w:rPr>
               <w:t>object</w:t>
             </w:r>
+            <w:proofErr w:type="spellEnd"/>
+            <w:proofErr w:type="gramEnd"/>
           </w:p>
         </w:tc>
         <w:tc>
@@ -10782,7 +11360,23 @@
                 <w:sz w:val="19"/>
                 <w:lang w:val="fr-CA"/>
               </w:rPr>
-              <w:t>L’endroit ou le vol se dirige.</w:t>
+              <w:t xml:space="preserve">L’endroit </w:t>
+            </w:r>
+            <w:proofErr w:type="spellStart"/>
+            <w:r>
+              <w:rPr>
+                <w:sz w:val="19"/>
+                <w:lang w:val="fr-CA"/>
+              </w:rPr>
+              <w:t>ou</w:t>
+            </w:r>
+            <w:proofErr w:type="spellEnd"/>
+            <w:r>
+              <w:rPr>
+                <w:sz w:val="19"/>
+                <w:lang w:val="fr-CA"/>
+              </w:rPr>
+              <w:t xml:space="preserve"> le vol se dirige.</w:t>
             </w:r>
           </w:p>
         </w:tc>
@@ -11140,13 +11734,31 @@
             <w:pPr>
               <w:jc w:val="center"/>
             </w:pPr>
+            <w:proofErr w:type="spellStart"/>
             <w:r>
               <w:rPr>
                 <w:b/>
                 <w:sz w:val="19"/>
               </w:rPr>
-              <w:t>Tâches prévues</w:t>
-            </w:r>
+              <w:t>Tâches</w:t>
+            </w:r>
+            <w:proofErr w:type="spellEnd"/>
+            <w:r>
+              <w:rPr>
+                <w:b/>
+                <w:sz w:val="19"/>
+              </w:rPr>
+              <w:t xml:space="preserve"> </w:t>
+            </w:r>
+            <w:proofErr w:type="spellStart"/>
+            <w:r>
+              <w:rPr>
+                <w:b/>
+                <w:sz w:val="19"/>
+              </w:rPr>
+              <w:t>prévues</w:t>
+            </w:r>
+            <w:proofErr w:type="spellEnd"/>
           </w:p>
         </w:tc>
         <w:tc>
@@ -11165,12 +11777,21 @@
             <w:pPr>
               <w:jc w:val="center"/>
             </w:pPr>
+            <w:proofErr w:type="spellStart"/>
             <w:r>
               <w:rPr>
                 <w:b/>
                 <w:sz w:val="19"/>
               </w:rPr>
-              <w:t>Responsable(s)</w:t>
+              <w:t>Responsable</w:t>
+            </w:r>
+            <w:proofErr w:type="spellEnd"/>
+            <w:r>
+              <w:rPr>
+                <w:b/>
+                <w:sz w:val="19"/>
+              </w:rPr>
+              <w:t>(s)</w:t>
             </w:r>
           </w:p>
         </w:tc>
@@ -11190,13 +11811,31 @@
             <w:pPr>
               <w:jc w:val="center"/>
             </w:pPr>
+            <w:proofErr w:type="spellStart"/>
             <w:r>
               <w:rPr>
                 <w:b/>
                 <w:sz w:val="19"/>
               </w:rPr>
-              <w:t>Échéance prévue</w:t>
-            </w:r>
+              <w:t>Échéance</w:t>
+            </w:r>
+            <w:proofErr w:type="spellEnd"/>
+            <w:r>
+              <w:rPr>
+                <w:b/>
+                <w:sz w:val="19"/>
+              </w:rPr>
+              <w:t xml:space="preserve"> </w:t>
+            </w:r>
+            <w:proofErr w:type="spellStart"/>
+            <w:r>
+              <w:rPr>
+                <w:b/>
+                <w:sz w:val="19"/>
+              </w:rPr>
+              <w:t>prévue</w:t>
+            </w:r>
+            <w:proofErr w:type="spellEnd"/>
           </w:p>
         </w:tc>
         <w:tc>
@@ -11247,13 +11886,31 @@
                 <w:szCs w:val="21"/>
               </w:rPr>
             </w:pPr>
+            <w:proofErr w:type="spellStart"/>
             <w:r>
               <w:rPr>
                 <w:sz w:val="18"/>
                 <w:szCs w:val="21"/>
               </w:rPr>
-              <w:t>Définition du problème</w:t>
-            </w:r>
+              <w:t>Définition</w:t>
+            </w:r>
+            <w:proofErr w:type="spellEnd"/>
+            <w:r>
+              <w:rPr>
+                <w:sz w:val="18"/>
+                <w:szCs w:val="21"/>
+              </w:rPr>
+              <w:t xml:space="preserve"> du </w:t>
+            </w:r>
+            <w:proofErr w:type="spellStart"/>
+            <w:r>
+              <w:rPr>
+                <w:sz w:val="18"/>
+                <w:szCs w:val="21"/>
+              </w:rPr>
+              <w:t>problème</w:t>
+            </w:r>
+            <w:proofErr w:type="spellEnd"/>
           </w:p>
         </w:tc>
         <w:tc>
@@ -11449,12 +12106,21 @@
               </w:rPr>
               <w:t xml:space="preserve"> </w:t>
             </w:r>
+            <w:proofErr w:type="spellStart"/>
             <w:r>
               <w:rPr>
                 <w:sz w:val="18"/>
                 <w:szCs w:val="21"/>
               </w:rPr>
-              <w:t>Collecte des données</w:t>
+              <w:t>Collecte</w:t>
+            </w:r>
+            <w:proofErr w:type="spellEnd"/>
+            <w:r>
+              <w:rPr>
+                <w:sz w:val="18"/>
+                <w:szCs w:val="21"/>
+              </w:rPr>
+              <w:t xml:space="preserve"> des données</w:t>
             </w:r>
           </w:p>
         </w:tc>
@@ -11792,12 +12458,21 @@
                 <w:szCs w:val="21"/>
               </w:rPr>
             </w:pPr>
+            <w:proofErr w:type="spellStart"/>
             <w:r>
               <w:rPr>
                 <w:sz w:val="18"/>
                 <w:szCs w:val="21"/>
               </w:rPr>
-              <w:t>Préparation des données</w:t>
+              <w:t>Préparation</w:t>
+            </w:r>
+            <w:proofErr w:type="spellEnd"/>
+            <w:r>
+              <w:rPr>
+                <w:sz w:val="18"/>
+                <w:szCs w:val="21"/>
+              </w:rPr>
+              <w:t xml:space="preserve"> des données</w:t>
             </w:r>
           </w:p>
         </w:tc>
@@ -11900,8 +12575,17 @@
                 <w:sz w:val="18"/>
                 <w:szCs w:val="21"/>
               </w:rPr>
-              <w:t>11 novembre</w:t>
-            </w:r>
+              <w:t xml:space="preserve">11 </w:t>
+            </w:r>
+            <w:proofErr w:type="spellStart"/>
+            <w:r>
+              <w:rPr>
+                <w:sz w:val="18"/>
+                <w:szCs w:val="21"/>
+              </w:rPr>
+              <w:t>novembre</w:t>
+            </w:r>
+            <w:proofErr w:type="spellEnd"/>
           </w:p>
         </w:tc>
         <w:tc>
@@ -11965,8 +12649,17 @@
                 <w:sz w:val="18"/>
                 <w:szCs w:val="21"/>
               </w:rPr>
-              <w:t xml:space="preserve"> Modélisation</w:t>
-            </w:r>
+              <w:t xml:space="preserve"> </w:t>
+            </w:r>
+            <w:proofErr w:type="spellStart"/>
+            <w:r>
+              <w:rPr>
+                <w:sz w:val="18"/>
+                <w:szCs w:val="21"/>
+              </w:rPr>
+              <w:t>Modélisation</w:t>
+            </w:r>
+            <w:proofErr w:type="spellEnd"/>
           </w:p>
         </w:tc>
         <w:tc>
@@ -12068,8 +12761,17 @@
                 <w:sz w:val="18"/>
                 <w:szCs w:val="21"/>
               </w:rPr>
-              <w:t>11 novembre</w:t>
-            </w:r>
+              <w:t xml:space="preserve">11 </w:t>
+            </w:r>
+            <w:proofErr w:type="spellStart"/>
+            <w:r>
+              <w:rPr>
+                <w:sz w:val="18"/>
+                <w:szCs w:val="21"/>
+              </w:rPr>
+              <w:t>novembre</w:t>
+            </w:r>
+            <w:proofErr w:type="spellEnd"/>
           </w:p>
         </w:tc>
         <w:tc>
@@ -12128,11 +12830,19 @@
               </w:rPr>
               <w:t xml:space="preserve"> </w:t>
             </w:r>
-            <w:r>
-              <w:rPr>
-                <w:sz w:val="19"/>
-              </w:rPr>
-              <w:t xml:space="preserve">Évaluation et </w:t>
+            <w:proofErr w:type="spellStart"/>
+            <w:r>
+              <w:rPr>
+                <w:sz w:val="19"/>
+              </w:rPr>
+              <w:t>Évaluation</w:t>
+            </w:r>
+            <w:proofErr w:type="spellEnd"/>
+            <w:r>
+              <w:rPr>
+                <w:sz w:val="19"/>
+              </w:rPr>
+              <w:t xml:space="preserve"> et </w:t>
             </w:r>
             <w:r>
               <w:rPr>
@@ -12221,8 +12931,17 @@
                 <w:sz w:val="18"/>
                 <w:szCs w:val="21"/>
               </w:rPr>
-              <w:t>11 novembre</w:t>
-            </w:r>
+              <w:t xml:space="preserve">11 </w:t>
+            </w:r>
+            <w:proofErr w:type="spellStart"/>
+            <w:r>
+              <w:rPr>
+                <w:sz w:val="18"/>
+                <w:szCs w:val="21"/>
+              </w:rPr>
+              <w:t>novembre</w:t>
+            </w:r>
+            <w:proofErr w:type="spellEnd"/>
           </w:p>
         </w:tc>
         <w:tc>
@@ -12273,6 +12992,7 @@
                 <w:szCs w:val="21"/>
               </w:rPr>
             </w:pPr>
+            <w:proofErr w:type="spellStart"/>
             <w:r>
               <w:rPr>
                 <w:sz w:val="18"/>
@@ -12280,6 +13000,7 @@
               </w:rPr>
               <w:t>Déploiement</w:t>
             </w:r>
+            <w:proofErr w:type="spellEnd"/>
           </w:p>
         </w:tc>
         <w:tc>
@@ -12440,8 +13161,17 @@
                 <w:sz w:val="18"/>
                 <w:szCs w:val="21"/>
               </w:rPr>
-              <w:t>9 décembre</w:t>
-            </w:r>
+              <w:t xml:space="preserve">9 </w:t>
+            </w:r>
+            <w:proofErr w:type="spellStart"/>
+            <w:r>
+              <w:rPr>
+                <w:sz w:val="18"/>
+                <w:szCs w:val="21"/>
+              </w:rPr>
+              <w:t>décembre</w:t>
+            </w:r>
+            <w:proofErr w:type="spellEnd"/>
           </w:p>
         </w:tc>
         <w:tc>
@@ -12597,8 +13327,17 @@
                 <w:sz w:val="18"/>
                 <w:szCs w:val="21"/>
               </w:rPr>
-              <w:t>16 décembre</w:t>
-            </w:r>
+              <w:t xml:space="preserve">16 </w:t>
+            </w:r>
+            <w:proofErr w:type="spellStart"/>
+            <w:r>
+              <w:rPr>
+                <w:sz w:val="18"/>
+                <w:szCs w:val="21"/>
+              </w:rPr>
+              <w:t>décembre</w:t>
+            </w:r>
+            <w:proofErr w:type="spellEnd"/>
           </w:p>
         </w:tc>
         <w:tc>
@@ -12683,7 +13422,43 @@
           <w:szCs w:val="20"/>
           <w:lang w:val="fr-CA"/>
         </w:rPr>
-        <w:t>Nous avons défini le problème, les objectifs et le périmètre du projet. Nous avons aussi réparti les tâches entre les membres de l’équipe. Pour finir, nous avons regarder les jeu de données.</w:t>
+        <w:t xml:space="preserve">Nous avons défini le problème, les objectifs et le périmètre du projet. Nous avons aussi réparti les tâches entre les membres de l’équipe. Pour finir, nous avons </w:t>
+      </w:r>
+      <w:proofErr w:type="spellStart"/>
+      <w:r>
+        <w:rPr>
+          <w:sz w:val="18"/>
+          <w:szCs w:val="20"/>
+          <w:lang w:val="fr-CA"/>
+        </w:rPr>
+        <w:t>regarder</w:t>
+      </w:r>
+      <w:proofErr w:type="spellEnd"/>
+      <w:r>
+        <w:rPr>
+          <w:sz w:val="18"/>
+          <w:szCs w:val="20"/>
+          <w:lang w:val="fr-CA"/>
+        </w:rPr>
+        <w:t xml:space="preserve"> </w:t>
+      </w:r>
+      <w:proofErr w:type="gramStart"/>
+      <w:r>
+        <w:rPr>
+          <w:sz w:val="18"/>
+          <w:szCs w:val="20"/>
+          <w:lang w:val="fr-CA"/>
+        </w:rPr>
+        <w:t>les jeu</w:t>
+      </w:r>
+      <w:proofErr w:type="gramEnd"/>
+      <w:r>
+        <w:rPr>
+          <w:sz w:val="18"/>
+          <w:szCs w:val="20"/>
+          <w:lang w:val="fr-CA"/>
+        </w:rPr>
+        <w:t xml:space="preserve"> de données.</w:t>
       </w:r>
     </w:p>
     <w:p>
@@ -12885,7 +13660,25 @@
           <w:szCs w:val="18"/>
           <w:lang w:val="fr-CA"/>
         </w:rPr>
-        <w:t xml:space="preserve">vérifier si le dataset est </w:t>
+        <w:t xml:space="preserve">vérifier si le </w:t>
+      </w:r>
+      <w:proofErr w:type="spellStart"/>
+      <w:r>
+        <w:rPr>
+          <w:sz w:val="18"/>
+          <w:szCs w:val="18"/>
+          <w:lang w:val="fr-CA"/>
+        </w:rPr>
+        <w:t>dataset</w:t>
+      </w:r>
+      <w:proofErr w:type="spellEnd"/>
+      <w:r>
+        <w:rPr>
+          <w:sz w:val="18"/>
+          <w:szCs w:val="18"/>
+          <w:lang w:val="fr-CA"/>
+        </w:rPr>
+        <w:t xml:space="preserve"> est </w:t>
       </w:r>
       <w:r>
         <w:rPr>
@@ -13249,13 +14042,31 @@
             <w:pPr>
               <w:jc w:val="center"/>
             </w:pPr>
+            <w:proofErr w:type="spellStart"/>
             <w:r>
               <w:rPr>
                 <w:b/>
                 <w:sz w:val="19"/>
               </w:rPr>
-              <w:t>Élément modifié</w:t>
-            </w:r>
+              <w:t>Élément</w:t>
+            </w:r>
+            <w:proofErr w:type="spellEnd"/>
+            <w:r>
+              <w:rPr>
+                <w:b/>
+                <w:sz w:val="19"/>
+              </w:rPr>
+              <w:t xml:space="preserve"> </w:t>
+            </w:r>
+            <w:proofErr w:type="spellStart"/>
+            <w:r>
+              <w:rPr>
+                <w:b/>
+                <w:sz w:val="19"/>
+              </w:rPr>
+              <w:t>modifié</w:t>
+            </w:r>
+            <w:proofErr w:type="spellEnd"/>
           </w:p>
         </w:tc>
         <w:tc>
@@ -13279,8 +14090,33 @@
                 <w:b/>
                 <w:sz w:val="19"/>
               </w:rPr>
-              <w:t>Ce qui était prévu</w:t>
-            </w:r>
+              <w:t xml:space="preserve">Ce qui </w:t>
+            </w:r>
+            <w:proofErr w:type="spellStart"/>
+            <w:r>
+              <w:rPr>
+                <w:b/>
+                <w:sz w:val="19"/>
+              </w:rPr>
+              <w:t>était</w:t>
+            </w:r>
+            <w:proofErr w:type="spellEnd"/>
+            <w:r>
+              <w:rPr>
+                <w:b/>
+                <w:sz w:val="19"/>
+              </w:rPr>
+              <w:t xml:space="preserve"> </w:t>
+            </w:r>
+            <w:proofErr w:type="spellStart"/>
+            <w:r>
+              <w:rPr>
+                <w:b/>
+                <w:sz w:val="19"/>
+              </w:rPr>
+              <w:t>prévu</w:t>
+            </w:r>
+            <w:proofErr w:type="spellEnd"/>
           </w:p>
         </w:tc>
         <w:tc>
@@ -13304,8 +14140,17 @@
                 <w:b/>
                 <w:sz w:val="19"/>
               </w:rPr>
-              <w:t>Ce qui a changé</w:t>
-            </w:r>
+              <w:t xml:space="preserve">Ce qui a </w:t>
+            </w:r>
+            <w:proofErr w:type="spellStart"/>
+            <w:r>
+              <w:rPr>
+                <w:b/>
+                <w:sz w:val="19"/>
+              </w:rPr>
+              <w:t>changé</w:t>
+            </w:r>
+            <w:proofErr w:type="spellEnd"/>
           </w:p>
         </w:tc>
         <w:tc>
@@ -13324,13 +14169,24 @@
             <w:pPr>
               <w:jc w:val="center"/>
             </w:pPr>
+            <w:proofErr w:type="spellStart"/>
+            <w:proofErr w:type="gramStart"/>
             <w:r>
               <w:rPr>
                 <w:b/>
                 <w:sz w:val="19"/>
               </w:rPr>
-              <w:t>Pourquoi ?</w:t>
-            </w:r>
+              <w:t>Pourquoi</w:t>
+            </w:r>
+            <w:proofErr w:type="spellEnd"/>
+            <w:r>
+              <w:rPr>
+                <w:b/>
+                <w:sz w:val="19"/>
+              </w:rPr>
+              <w:t xml:space="preserve"> ?</w:t>
+            </w:r>
+            <w:proofErr w:type="gramEnd"/>
           </w:p>
         </w:tc>
       </w:tr>
@@ -13675,7 +14531,15 @@
       </w:pPr>
       <w:bookmarkStart w:id="27" w:name="_Toc2082795802"/>
       <w:r>
-        <w:t>10. Préparation des données</w:t>
+        <w:t xml:space="preserve">10. </w:t>
+      </w:r>
+      <w:proofErr w:type="spellStart"/>
+      <w:r>
+        <w:t>Préparation</w:t>
+      </w:r>
+      <w:proofErr w:type="spellEnd"/>
+      <w:r>
+        <w:t xml:space="preserve"> des données</w:t>
       </w:r>
       <w:bookmarkEnd w:id="27"/>
     </w:p>
@@ -13732,8 +14596,17 @@
                 <w:b/>
                 <w:sz w:val="19"/>
               </w:rPr>
-              <w:t>Action réalisée</w:t>
-            </w:r>
+              <w:t xml:space="preserve">Action </w:t>
+            </w:r>
+            <w:proofErr w:type="spellStart"/>
+            <w:r>
+              <w:rPr>
+                <w:b/>
+                <w:sz w:val="19"/>
+              </w:rPr>
+              <w:t>réalisée</w:t>
+            </w:r>
+            <w:proofErr w:type="spellEnd"/>
           </w:p>
         </w:tc>
         <w:tc>
@@ -13752,13 +14625,56 @@
             <w:pPr>
               <w:jc w:val="center"/>
             </w:pPr>
+            <w:proofErr w:type="spellStart"/>
             <w:r>
               <w:rPr>
                 <w:b/>
                 <w:sz w:val="19"/>
               </w:rPr>
-              <w:t>Pourquoi était-elle nécessaire ?</w:t>
-            </w:r>
+              <w:t>Pourquoi</w:t>
+            </w:r>
+            <w:proofErr w:type="spellEnd"/>
+            <w:r>
+              <w:rPr>
+                <w:b/>
+                <w:sz w:val="19"/>
+              </w:rPr>
+              <w:t xml:space="preserve"> </w:t>
+            </w:r>
+            <w:proofErr w:type="spellStart"/>
+            <w:r>
+              <w:rPr>
+                <w:b/>
+                <w:sz w:val="19"/>
+              </w:rPr>
+              <w:t>était-elle</w:t>
+            </w:r>
+            <w:proofErr w:type="spellEnd"/>
+            <w:r>
+              <w:rPr>
+                <w:b/>
+                <w:sz w:val="19"/>
+              </w:rPr>
+              <w:t xml:space="preserve"> </w:t>
+            </w:r>
+            <w:proofErr w:type="spellStart"/>
+            <w:proofErr w:type="gramStart"/>
+            <w:r>
+              <w:rPr>
+                <w:b/>
+                <w:sz w:val="19"/>
+              </w:rPr>
+              <w:t>nécessaire</w:t>
+            </w:r>
+            <w:proofErr w:type="spellEnd"/>
+            <w:r>
+              <w:rPr>
+                <w:b/>
+                <w:sz w:val="19"/>
+              </w:rPr>
+              <w:t xml:space="preserve"> ?</w:t>
+            </w:r>
+            <w:proofErr w:type="gramEnd"/>
           </w:p>
         </w:tc>
         <w:tc>
@@ -13777,13 +14693,47 @@
             <w:pPr>
               <w:jc w:val="center"/>
             </w:pPr>
+            <w:proofErr w:type="spellStart"/>
             <w:r>
               <w:rPr>
                 <w:b/>
                 <w:sz w:val="19"/>
               </w:rPr>
-              <w:t>Résultat / effet obtenu</w:t>
-            </w:r>
+              <w:t>Résultat</w:t>
+            </w:r>
+            <w:proofErr w:type="spellEnd"/>
+            <w:r>
+              <w:rPr>
+                <w:b/>
+                <w:sz w:val="19"/>
+              </w:rPr>
+              <w:t xml:space="preserve"> / </w:t>
+            </w:r>
+            <w:proofErr w:type="spellStart"/>
+            <w:r>
+              <w:rPr>
+                <w:b/>
+                <w:sz w:val="19"/>
+              </w:rPr>
+              <w:t>effet</w:t>
+            </w:r>
+            <w:proofErr w:type="spellEnd"/>
+            <w:r>
+              <w:rPr>
+                <w:b/>
+                <w:sz w:val="19"/>
+              </w:rPr>
+              <w:t xml:space="preserve"> </w:t>
+            </w:r>
+            <w:proofErr w:type="spellStart"/>
+            <w:r>
+              <w:rPr>
+                <w:b/>
+                <w:sz w:val="19"/>
+              </w:rPr>
+              <w:t>obtenu</w:t>
+            </w:r>
+            <w:proofErr w:type="spellEnd"/>
           </w:p>
         </w:tc>
       </w:tr>
@@ -14268,8 +15218,17 @@
                 <w:b/>
                 <w:sz w:val="19"/>
               </w:rPr>
-              <w:t>Transformation appliquée</w:t>
-            </w:r>
+              <w:t xml:space="preserve">Transformation </w:t>
+            </w:r>
+            <w:proofErr w:type="spellStart"/>
+            <w:r>
+              <w:rPr>
+                <w:b/>
+                <w:sz w:val="19"/>
+              </w:rPr>
+              <w:t>appliquée</w:t>
+            </w:r>
+            <w:proofErr w:type="spellEnd"/>
           </w:p>
         </w:tc>
         <w:tc>
@@ -14288,13 +15247,24 @@
             <w:pPr>
               <w:jc w:val="center"/>
             </w:pPr>
+            <w:proofErr w:type="spellStart"/>
+            <w:proofErr w:type="gramStart"/>
             <w:r>
               <w:rPr>
                 <w:b/>
                 <w:sz w:val="19"/>
               </w:rPr>
-              <w:t>Utilisée ?</w:t>
-            </w:r>
+              <w:t>Utilisée</w:t>
+            </w:r>
+            <w:proofErr w:type="spellEnd"/>
+            <w:r>
+              <w:rPr>
+                <w:b/>
+                <w:sz w:val="19"/>
+              </w:rPr>
+              <w:t xml:space="preserve"> ?</w:t>
+            </w:r>
+            <w:proofErr w:type="gramEnd"/>
           </w:p>
         </w:tc>
       </w:tr>
@@ -14816,9 +15786,14 @@
       </w:pPr>
       <w:bookmarkStart w:id="29" w:name="_Toc1769301782"/>
       <w:r>
-        <w:t>11. Modélisation</w:t>
+        <w:t xml:space="preserve">11. </w:t>
+      </w:r>
+      <w:proofErr w:type="spellStart"/>
+      <w:r>
+        <w:t>Modélisation</w:t>
       </w:r>
       <w:bookmarkEnd w:id="29"/>
+      <w:proofErr w:type="spellEnd"/>
     </w:p>
     <w:p>
       <w:pPr>
@@ -14827,9 +15802,22 @@
       </w:pPr>
       <w:bookmarkStart w:id="30" w:name="_Toc561233477"/>
       <w:r>
-        <w:t>11.1 Modèle de référence</w:t>
+        <w:t xml:space="preserve">11.1 </w:t>
+      </w:r>
+      <w:proofErr w:type="spellStart"/>
+      <w:r>
+        <w:t>Modèle</w:t>
+      </w:r>
+      <w:proofErr w:type="spellEnd"/>
+      <w:r>
+        <w:t xml:space="preserve"> de </w:t>
+      </w:r>
+      <w:proofErr w:type="spellStart"/>
+      <w:r>
+        <w:t>référence</w:t>
       </w:r>
       <w:bookmarkEnd w:id="30"/>
+      <w:proofErr w:type="spellEnd"/>
     </w:p>
     <w:p>
       <w:pPr>
@@ -14984,13 +15972,31 @@
             <w:pPr>
               <w:jc w:val="center"/>
             </w:pPr>
+            <w:proofErr w:type="spellStart"/>
             <w:r>
               <w:rPr>
                 <w:b/>
                 <w:sz w:val="19"/>
               </w:rPr>
-              <w:t>Modèle / approche</w:t>
-            </w:r>
+              <w:t>Modèle</w:t>
+            </w:r>
+            <w:proofErr w:type="spellEnd"/>
+            <w:r>
+              <w:rPr>
+                <w:b/>
+                <w:sz w:val="19"/>
+              </w:rPr>
+              <w:t xml:space="preserve"> / </w:t>
+            </w:r>
+            <w:proofErr w:type="spellStart"/>
+            <w:r>
+              <w:rPr>
+                <w:b/>
+                <w:sz w:val="19"/>
+              </w:rPr>
+              <w:t>approche</w:t>
+            </w:r>
+            <w:proofErr w:type="spellEnd"/>
           </w:p>
         </w:tc>
         <w:tc>
@@ -15009,13 +16015,56 @@
             <w:pPr>
               <w:jc w:val="center"/>
             </w:pPr>
+            <w:proofErr w:type="spellStart"/>
             <w:r>
               <w:rPr>
                 <w:b/>
                 <w:sz w:val="19"/>
               </w:rPr>
-              <w:t>Pourquoi l’avoir testé ?</w:t>
-            </w:r>
+              <w:t>Pourquoi</w:t>
+            </w:r>
+            <w:proofErr w:type="spellEnd"/>
+            <w:r>
+              <w:rPr>
+                <w:b/>
+                <w:sz w:val="19"/>
+              </w:rPr>
+              <w:t xml:space="preserve"> </w:t>
+            </w:r>
+            <w:proofErr w:type="spellStart"/>
+            <w:r>
+              <w:rPr>
+                <w:b/>
+                <w:sz w:val="19"/>
+              </w:rPr>
+              <w:t>l’avoir</w:t>
+            </w:r>
+            <w:proofErr w:type="spellEnd"/>
+            <w:r>
+              <w:rPr>
+                <w:b/>
+                <w:sz w:val="19"/>
+              </w:rPr>
+              <w:t xml:space="preserve"> </w:t>
+            </w:r>
+            <w:proofErr w:type="spellStart"/>
+            <w:proofErr w:type="gramStart"/>
+            <w:r>
+              <w:rPr>
+                <w:b/>
+                <w:sz w:val="19"/>
+              </w:rPr>
+              <w:t>testé</w:t>
+            </w:r>
+            <w:proofErr w:type="spellEnd"/>
+            <w:r>
+              <w:rPr>
+                <w:b/>
+                <w:sz w:val="19"/>
+              </w:rPr>
+              <w:t xml:space="preserve"> ?</w:t>
+            </w:r>
+            <w:proofErr w:type="gramEnd"/>
           </w:p>
         </w:tc>
         <w:tc>
@@ -15034,13 +16083,63 @@
             <w:pPr>
               <w:jc w:val="center"/>
             </w:pPr>
+            <w:proofErr w:type="spellStart"/>
             <w:r>
               <w:rPr>
                 <w:b/>
                 <w:sz w:val="19"/>
               </w:rPr>
-              <w:t>Paramètres ou éléments importants</w:t>
-            </w:r>
+              <w:t>Paramètres</w:t>
+            </w:r>
+            <w:proofErr w:type="spellEnd"/>
+            <w:r>
+              <w:rPr>
+                <w:b/>
+                <w:sz w:val="19"/>
+              </w:rPr>
+              <w:t xml:space="preserve"> </w:t>
+            </w:r>
+            <w:proofErr w:type="spellStart"/>
+            <w:r>
+              <w:rPr>
+                <w:b/>
+                <w:sz w:val="19"/>
+              </w:rPr>
+              <w:t>ou</w:t>
+            </w:r>
+            <w:proofErr w:type="spellEnd"/>
+            <w:r>
+              <w:rPr>
+                <w:b/>
+                <w:sz w:val="19"/>
+              </w:rPr>
+              <w:t xml:space="preserve"> </w:t>
+            </w:r>
+            <w:proofErr w:type="spellStart"/>
+            <w:r>
+              <w:rPr>
+                <w:b/>
+                <w:sz w:val="19"/>
+              </w:rPr>
+              <w:t>éléments</w:t>
+            </w:r>
+            <w:proofErr w:type="spellEnd"/>
+            <w:r>
+              <w:rPr>
+                <w:b/>
+                <w:sz w:val="19"/>
+              </w:rPr>
+              <w:t xml:space="preserve"> </w:t>
+            </w:r>
+            <w:proofErr w:type="spellStart"/>
+            <w:r>
+              <w:rPr>
+                <w:b/>
+                <w:sz w:val="19"/>
+              </w:rPr>
+              <w:t>importants</w:t>
+            </w:r>
+            <w:proofErr w:type="spellEnd"/>
           </w:p>
         </w:tc>
       </w:tr>
@@ -15309,9 +16408,14 @@
       </w:pPr>
       <w:bookmarkStart w:id="32" w:name="_Toc1288578959"/>
       <w:r>
-        <w:t>12. Optimisation</w:t>
+        <w:t xml:space="preserve">12. </w:t>
+      </w:r>
+      <w:proofErr w:type="spellStart"/>
+      <w:r>
+        <w:t>Optimisation</w:t>
       </w:r>
       <w:bookmarkEnd w:id="32"/>
+      <w:proofErr w:type="spellEnd"/>
     </w:p>
     <w:p>
       <w:pPr>
@@ -15361,14 +16465,32 @@
             <w:pPr>
               <w:jc w:val="center"/>
             </w:pPr>
+            <w:proofErr w:type="spellStart"/>
             <w:r>
               <w:rPr>
                 <w:b/>
                 <w:sz w:val="19"/>
               </w:rPr>
               <w:lastRenderedPageBreak/>
-              <w:t>Approche d’optimisation</w:t>
-            </w:r>
+              <w:t>Approche</w:t>
+            </w:r>
+            <w:proofErr w:type="spellEnd"/>
+            <w:r>
+              <w:rPr>
+                <w:b/>
+                <w:sz w:val="19"/>
+              </w:rPr>
+              <w:t xml:space="preserve"> </w:t>
+            </w:r>
+            <w:proofErr w:type="spellStart"/>
+            <w:r>
+              <w:rPr>
+                <w:b/>
+                <w:sz w:val="19"/>
+              </w:rPr>
+              <w:t>d’optimisation</w:t>
+            </w:r>
+            <w:proofErr w:type="spellEnd"/>
           </w:p>
         </w:tc>
         <w:tc>
@@ -15416,13 +16538,31 @@
             <w:pPr>
               <w:jc w:val="center"/>
             </w:pPr>
+            <w:proofErr w:type="spellStart"/>
             <w:r>
               <w:rPr>
                 <w:b/>
                 <w:sz w:val="19"/>
               </w:rPr>
-              <w:t>Effet observé</w:t>
-            </w:r>
+              <w:t>Effet</w:t>
+            </w:r>
+            <w:proofErr w:type="spellEnd"/>
+            <w:r>
+              <w:rPr>
+                <w:b/>
+                <w:sz w:val="19"/>
+              </w:rPr>
+              <w:t xml:space="preserve"> </w:t>
+            </w:r>
+            <w:proofErr w:type="spellStart"/>
+            <w:r>
+              <w:rPr>
+                <w:b/>
+                <w:sz w:val="19"/>
+              </w:rPr>
+              <w:t>observé</w:t>
+            </w:r>
+            <w:proofErr w:type="spellEnd"/>
           </w:p>
         </w:tc>
       </w:tr>
@@ -15691,9 +16831,22 @@
       </w:pPr>
       <w:bookmarkStart w:id="33" w:name="_Toc648129540"/>
       <w:r>
-        <w:t>13. Évaluation des modèles</w:t>
+        <w:t xml:space="preserve">13. </w:t>
+      </w:r>
+      <w:proofErr w:type="spellStart"/>
+      <w:r>
+        <w:t>Évaluation</w:t>
+      </w:r>
+      <w:proofErr w:type="spellEnd"/>
+      <w:r>
+        <w:t xml:space="preserve"> des </w:t>
+      </w:r>
+      <w:proofErr w:type="spellStart"/>
+      <w:r>
+        <w:t>modèles</w:t>
       </w:r>
       <w:bookmarkEnd w:id="33"/>
+      <w:proofErr w:type="spellEnd"/>
     </w:p>
     <w:p>
       <w:pPr>
@@ -15702,9 +16855,22 @@
       </w:pPr>
       <w:bookmarkStart w:id="34" w:name="_Toc1037145765"/>
       <w:r>
-        <w:t>13.1 Métriques utilisées</w:t>
+        <w:t xml:space="preserve">13.1 </w:t>
+      </w:r>
+      <w:proofErr w:type="spellStart"/>
+      <w:r>
+        <w:t>Métriques</w:t>
+      </w:r>
+      <w:proofErr w:type="spellEnd"/>
+      <w:r>
+        <w:t xml:space="preserve"> </w:t>
+      </w:r>
+      <w:proofErr w:type="spellStart"/>
+      <w:r>
+        <w:t>utilisées</w:t>
       </w:r>
       <w:bookmarkEnd w:id="34"/>
+      <w:proofErr w:type="spellEnd"/>
     </w:p>
     <w:p>
       <w:pPr>
@@ -15753,6 +16919,7 @@
             <w:pPr>
               <w:jc w:val="center"/>
             </w:pPr>
+            <w:proofErr w:type="spellStart"/>
             <w:r>
               <w:rPr>
                 <w:b/>
@@ -15760,6 +16927,7 @@
               </w:rPr>
               <w:t>Métrique</w:t>
             </w:r>
+            <w:proofErr w:type="spellEnd"/>
           </w:p>
         </w:tc>
         <w:tc>
@@ -15976,9 +17144,14 @@
       </w:pPr>
       <w:bookmarkStart w:id="35" w:name="_Toc321043625"/>
       <w:r>
-        <w:t>13.2 Résultats</w:t>
+        <w:t xml:space="preserve">13.2 </w:t>
+      </w:r>
+      <w:proofErr w:type="spellStart"/>
+      <w:r>
+        <w:t>Résultats</w:t>
       </w:r>
       <w:bookmarkEnd w:id="35"/>
+      <w:proofErr w:type="spellEnd"/>
     </w:p>
     <w:tbl>
       <w:tblPr>
@@ -16016,6 +17189,7 @@
             <w:pPr>
               <w:jc w:val="center"/>
             </w:pPr>
+            <w:proofErr w:type="spellStart"/>
             <w:r>
               <w:rPr>
                 <w:b/>
@@ -16023,6 +17197,7 @@
               </w:rPr>
               <w:t>Modèle</w:t>
             </w:r>
+            <w:proofErr w:type="spellEnd"/>
           </w:p>
         </w:tc>
         <w:tc>
@@ -16041,12 +17216,21 @@
             <w:pPr>
               <w:jc w:val="center"/>
             </w:pPr>
+            <w:proofErr w:type="spellStart"/>
             <w:r>
               <w:rPr>
                 <w:b/>
                 <w:sz w:val="19"/>
               </w:rPr>
-              <w:t>Métrique 1</w:t>
+              <w:t>Métrique</w:t>
+            </w:r>
+            <w:proofErr w:type="spellEnd"/>
+            <w:r>
+              <w:rPr>
+                <w:b/>
+                <w:sz w:val="19"/>
+              </w:rPr>
+              <w:t xml:space="preserve"> 1</w:t>
             </w:r>
           </w:p>
         </w:tc>
@@ -16066,12 +17250,21 @@
             <w:pPr>
               <w:jc w:val="center"/>
             </w:pPr>
+            <w:proofErr w:type="spellStart"/>
             <w:r>
               <w:rPr>
                 <w:b/>
                 <w:sz w:val="19"/>
               </w:rPr>
-              <w:t>Métrique 2</w:t>
+              <w:t>Métrique</w:t>
+            </w:r>
+            <w:proofErr w:type="spellEnd"/>
+            <w:r>
+              <w:rPr>
+                <w:b/>
+                <w:sz w:val="19"/>
+              </w:rPr>
+              <w:t xml:space="preserve"> 2</w:t>
             </w:r>
           </w:p>
         </w:tc>
@@ -16091,12 +17284,21 @@
             <w:pPr>
               <w:jc w:val="center"/>
             </w:pPr>
+            <w:proofErr w:type="spellStart"/>
             <w:r>
               <w:rPr>
                 <w:b/>
                 <w:sz w:val="19"/>
               </w:rPr>
-              <w:t>Métrique 3</w:t>
+              <w:t>Métrique</w:t>
+            </w:r>
+            <w:proofErr w:type="spellEnd"/>
+            <w:r>
+              <w:rPr>
+                <w:b/>
+                <w:sz w:val="19"/>
+              </w:rPr>
+              <w:t xml:space="preserve"> 3</w:t>
             </w:r>
           </w:p>
         </w:tc>
@@ -16121,8 +17323,17 @@
                 <w:b/>
                 <w:sz w:val="19"/>
               </w:rPr>
-              <w:t>Observation principale</w:t>
-            </w:r>
+              <w:t xml:space="preserve">Observation </w:t>
+            </w:r>
+            <w:proofErr w:type="spellStart"/>
+            <w:r>
+              <w:rPr>
+                <w:b/>
+                <w:sz w:val="19"/>
+              </w:rPr>
+              <w:t>principale</w:t>
+            </w:r>
+            <w:proofErr w:type="spellEnd"/>
           </w:p>
         </w:tc>
       </w:tr>
@@ -16543,9 +17754,22 @@
       </w:pPr>
       <w:bookmarkStart w:id="36" w:name="_Toc1853460085"/>
       <w:r>
-        <w:t>13.3 Analyse des résultats</w:t>
+        <w:t xml:space="preserve">13.3 </w:t>
+      </w:r>
+      <w:proofErr w:type="spellStart"/>
+      <w:r>
+        <w:t>Analyse</w:t>
+      </w:r>
+      <w:proofErr w:type="spellEnd"/>
+      <w:r>
+        <w:t xml:space="preserve"> des </w:t>
+      </w:r>
+      <w:proofErr w:type="spellStart"/>
+      <w:r>
+        <w:t>résultats</w:t>
       </w:r>
       <w:bookmarkEnd w:id="36"/>
+      <w:proofErr w:type="spellEnd"/>
     </w:p>
     <w:p>
       <w:pPr>
@@ -17253,6 +18477,7 @@
             <w:pPr>
               <w:jc w:val="center"/>
             </w:pPr>
+            <w:proofErr w:type="spellStart"/>
             <w:r>
               <w:rPr>
                 <w:b/>
@@ -17260,6 +18485,7 @@
               </w:rPr>
               <w:t>Élément</w:t>
             </w:r>
+            <w:proofErr w:type="spellEnd"/>
           </w:p>
         </w:tc>
         <w:tc>
@@ -17278,6 +18504,7 @@
             <w:pPr>
               <w:jc w:val="center"/>
             </w:pPr>
+            <w:proofErr w:type="spellStart"/>
             <w:r>
               <w:rPr>
                 <w:b/>
@@ -17285,6 +18512,7 @@
               </w:rPr>
               <w:t>Réponse</w:t>
             </w:r>
+            <w:proofErr w:type="spellEnd"/>
           </w:p>
         </w:tc>
       </w:tr>
@@ -17304,12 +18532,42 @@
             </w:tcMar>
           </w:tcPr>
           <w:p>
+            <w:proofErr w:type="spellStart"/>
             <w:r>
               <w:rPr>
                 <w:b/>
               </w:rPr>
-              <w:t>Modèle / approche retenue</w:t>
-            </w:r>
+              <w:t>Modèle</w:t>
+            </w:r>
+            <w:proofErr w:type="spellEnd"/>
+            <w:r>
+              <w:rPr>
+                <w:b/>
+              </w:rPr>
+              <w:t xml:space="preserve"> / </w:t>
+            </w:r>
+            <w:proofErr w:type="spellStart"/>
+            <w:r>
+              <w:rPr>
+                <w:b/>
+              </w:rPr>
+              <w:t>approche</w:t>
+            </w:r>
+            <w:proofErr w:type="spellEnd"/>
+            <w:r>
+              <w:rPr>
+                <w:b/>
+              </w:rPr>
+              <w:t xml:space="preserve"> </w:t>
+            </w:r>
+            <w:proofErr w:type="spellStart"/>
+            <w:r>
+              <w:rPr>
+                <w:b/>
+              </w:rPr>
+              <w:t>retenue</w:t>
+            </w:r>
+            <w:proofErr w:type="spellEnd"/>
           </w:p>
         </w:tc>
         <w:tc>
@@ -17352,8 +18610,16 @@
               <w:rPr>
                 <w:b/>
               </w:rPr>
-              <w:t>Performance principale</w:t>
-            </w:r>
+              <w:t xml:space="preserve">Performance </w:t>
+            </w:r>
+            <w:proofErr w:type="spellStart"/>
+            <w:r>
+              <w:rPr>
+                <w:b/>
+              </w:rPr>
+              <w:t>principale</w:t>
+            </w:r>
+            <w:proofErr w:type="spellEnd"/>
           </w:p>
         </w:tc>
         <w:tc>
@@ -17392,12 +18658,42 @@
             </w:tcMar>
           </w:tcPr>
           <w:p>
+            <w:proofErr w:type="spellStart"/>
             <w:r>
               <w:rPr>
                 <w:b/>
               </w:rPr>
-              <w:t>Pourquoi ce choix ?</w:t>
-            </w:r>
+              <w:t>Pourquoi</w:t>
+            </w:r>
+            <w:proofErr w:type="spellEnd"/>
+            <w:r>
+              <w:rPr>
+                <w:b/>
+              </w:rPr>
+              <w:t xml:space="preserve"> </w:t>
+            </w:r>
+            <w:proofErr w:type="spellStart"/>
+            <w:r>
+              <w:rPr>
+                <w:b/>
+              </w:rPr>
+              <w:t>ce</w:t>
+            </w:r>
+            <w:proofErr w:type="spellEnd"/>
+            <w:r>
+              <w:rPr>
+                <w:b/>
+              </w:rPr>
+              <w:t xml:space="preserve"> </w:t>
+            </w:r>
+            <w:proofErr w:type="gramStart"/>
+            <w:r>
+              <w:rPr>
+                <w:b/>
+              </w:rPr>
+              <w:t>choix ?</w:t>
+            </w:r>
+            <w:proofErr w:type="gramEnd"/>
           </w:p>
         </w:tc>
         <w:tc>
@@ -17440,8 +18736,16 @@
               <w:rPr>
                 <w:b/>
               </w:rPr>
-              <w:t>Entrées nécessaires</w:t>
-            </w:r>
+              <w:t xml:space="preserve">Entrées </w:t>
+            </w:r>
+            <w:proofErr w:type="spellStart"/>
+            <w:r>
+              <w:rPr>
+                <w:b/>
+              </w:rPr>
+              <w:t>nécessaires</w:t>
+            </w:r>
+            <w:proofErr w:type="spellEnd"/>
           </w:p>
         </w:tc>
         <w:tc>
@@ -17480,12 +18784,28 @@
             </w:tcMar>
           </w:tcPr>
           <w:p>
+            <w:proofErr w:type="spellStart"/>
             <w:r>
               <w:rPr>
                 <w:b/>
               </w:rPr>
-              <w:t>Résultat produit</w:t>
-            </w:r>
+              <w:t>Résultat</w:t>
+            </w:r>
+            <w:proofErr w:type="spellEnd"/>
+            <w:r>
+              <w:rPr>
+                <w:b/>
+              </w:rPr>
+              <w:t xml:space="preserve"> </w:t>
+            </w:r>
+            <w:proofErr w:type="spellStart"/>
+            <w:r>
+              <w:rPr>
+                <w:b/>
+              </w:rPr>
+              <w:t>produit</w:t>
+            </w:r>
+            <w:proofErr w:type="spellEnd"/>
           </w:p>
         </w:tc>
         <w:tc>
@@ -17521,7 +18841,15 @@
       </w:pPr>
       <w:bookmarkStart w:id="39" w:name="_Toc713898782"/>
       <w:r>
-        <w:t>16. Déploiement / prototype</w:t>
+        <w:t xml:space="preserve">16. </w:t>
+      </w:r>
+      <w:proofErr w:type="spellStart"/>
+      <w:r>
+        <w:t>Déploiement</w:t>
+      </w:r>
+      <w:proofErr w:type="spellEnd"/>
+      <w:r>
+        <w:t xml:space="preserve"> / prototype</w:t>
       </w:r>
       <w:bookmarkEnd w:id="39"/>
     </w:p>
@@ -17572,6 +18900,7 @@
             <w:pPr>
               <w:jc w:val="center"/>
             </w:pPr>
+            <w:proofErr w:type="spellStart"/>
             <w:r>
               <w:rPr>
                 <w:b/>
@@ -17579,6 +18908,7 @@
               </w:rPr>
               <w:t>Élément</w:t>
             </w:r>
+            <w:proofErr w:type="spellEnd"/>
           </w:p>
         </w:tc>
         <w:tc>
@@ -17667,12 +18997,14 @@
             </w:tcMar>
           </w:tcPr>
           <w:p>
+            <w:proofErr w:type="spellStart"/>
             <w:r>
               <w:rPr>
                 <w:b/>
               </w:rPr>
               <w:t>Traitement</w:t>
             </w:r>
+            <w:proofErr w:type="spellEnd"/>
           </w:p>
         </w:tc>
         <w:tc>
@@ -17755,12 +19087,28 @@
             </w:tcMar>
           </w:tcPr>
           <w:p>
+            <w:proofErr w:type="spellStart"/>
             <w:r>
               <w:rPr>
                 <w:b/>
               </w:rPr>
-              <w:t>Utilisateur visé</w:t>
-            </w:r>
+              <w:t>Utilisateur</w:t>
+            </w:r>
+            <w:proofErr w:type="spellEnd"/>
+            <w:r>
+              <w:rPr>
+                <w:b/>
+              </w:rPr>
+              <w:t xml:space="preserve"> </w:t>
+            </w:r>
+            <w:proofErr w:type="spellStart"/>
+            <w:r>
+              <w:rPr>
+                <w:b/>
+              </w:rPr>
+              <w:t>visé</w:t>
+            </w:r>
+            <w:proofErr w:type="spellEnd"/>
           </w:p>
         </w:tc>
         <w:tc>
@@ -17796,7 +19144,15 @@
       </w:pPr>
       <w:bookmarkStart w:id="40" w:name="_Toc1543314659"/>
       <w:r>
-        <w:t>17. Mode d’utilisation de la solution</w:t>
+        <w:t xml:space="preserve">17. Mode </w:t>
+      </w:r>
+      <w:proofErr w:type="spellStart"/>
+      <w:r>
+        <w:t>d’utilisation</w:t>
+      </w:r>
+      <w:proofErr w:type="spellEnd"/>
+      <w:r>
+        <w:t xml:space="preserve"> de la solution</w:t>
       </w:r>
       <w:bookmarkEnd w:id="40"/>
     </w:p>
@@ -17877,8 +19233,17 @@
                 <w:b/>
                 <w:sz w:val="19"/>
               </w:rPr>
-              <w:t>Action à réaliser</w:t>
-            </w:r>
+              <w:t xml:space="preserve">Action à </w:t>
+            </w:r>
+            <w:proofErr w:type="spellStart"/>
+            <w:r>
+              <w:rPr>
+                <w:b/>
+                <w:sz w:val="19"/>
+              </w:rPr>
+              <w:t>réaliser</w:t>
+            </w:r>
+            <w:proofErr w:type="spellEnd"/>
           </w:p>
         </w:tc>
       </w:tr>
@@ -18116,7 +19481,15 @@
       </w:pPr>
       <w:bookmarkStart w:id="41" w:name="_Toc1790874591"/>
       <w:r>
-        <w:t>18. Suivi et maintenance</w:t>
+        <w:t xml:space="preserve">18. </w:t>
+      </w:r>
+      <w:proofErr w:type="spellStart"/>
+      <w:r>
+        <w:t>Suivi</w:t>
+      </w:r>
+      <w:proofErr w:type="spellEnd"/>
+      <w:r>
+        <w:t xml:space="preserve"> et maintenance</w:t>
       </w:r>
       <w:bookmarkEnd w:id="41"/>
     </w:p>
@@ -18168,13 +19541,31 @@
             <w:pPr>
               <w:jc w:val="center"/>
             </w:pPr>
+            <w:proofErr w:type="spellStart"/>
             <w:r>
               <w:rPr>
                 <w:b/>
                 <w:sz w:val="19"/>
               </w:rPr>
-              <w:t>Élément à surveiller</w:t>
-            </w:r>
+              <w:t>Élément</w:t>
+            </w:r>
+            <w:proofErr w:type="spellEnd"/>
+            <w:r>
+              <w:rPr>
+                <w:b/>
+                <w:sz w:val="19"/>
+              </w:rPr>
+              <w:t xml:space="preserve"> à </w:t>
+            </w:r>
+            <w:proofErr w:type="spellStart"/>
+            <w:r>
+              <w:rPr>
+                <w:b/>
+                <w:sz w:val="19"/>
+              </w:rPr>
+              <w:t>surveiller</w:t>
+            </w:r>
+            <w:proofErr w:type="spellEnd"/>
           </w:p>
         </w:tc>
         <w:tc>
@@ -18193,13 +19584,24 @@
             <w:pPr>
               <w:jc w:val="center"/>
             </w:pPr>
+            <w:proofErr w:type="spellStart"/>
+            <w:proofErr w:type="gramStart"/>
             <w:r>
               <w:rPr>
                 <w:b/>
                 <w:sz w:val="19"/>
               </w:rPr>
-              <w:t>Pourquoi ?</w:t>
-            </w:r>
+              <w:t>Pourquoi</w:t>
+            </w:r>
+            <w:proofErr w:type="spellEnd"/>
+            <w:r>
+              <w:rPr>
+                <w:b/>
+                <w:sz w:val="19"/>
+              </w:rPr>
+              <w:t xml:space="preserve"> ?</w:t>
+            </w:r>
+            <w:proofErr w:type="gramEnd"/>
           </w:p>
         </w:tc>
         <w:tc>
@@ -18493,9 +19895,22 @@
       </w:pPr>
       <w:bookmarkStart w:id="42" w:name="_Toc662715352"/>
       <w:r>
-        <w:t>19. Limites du projet</w:t>
+        <w:t xml:space="preserve">19. </w:t>
+      </w:r>
+      <w:proofErr w:type="spellStart"/>
+      <w:r>
+        <w:t>Limites</w:t>
+      </w:r>
+      <w:proofErr w:type="spellEnd"/>
+      <w:r>
+        <w:t xml:space="preserve"> du </w:t>
+      </w:r>
+      <w:proofErr w:type="spellStart"/>
+      <w:r>
+        <w:t>projet</w:t>
       </w:r>
       <w:bookmarkEnd w:id="42"/>
+      <w:proofErr w:type="spellEnd"/>
     </w:p>
     <w:p>
       <w:pPr>
@@ -18671,8 +20086,17 @@
                 <w:b/>
                 <w:sz w:val="19"/>
               </w:rPr>
-              <w:t>Risque / considération</w:t>
-            </w:r>
+              <w:t xml:space="preserve">Risque / </w:t>
+            </w:r>
+            <w:proofErr w:type="spellStart"/>
+            <w:r>
+              <w:rPr>
+                <w:b/>
+                <w:sz w:val="19"/>
+              </w:rPr>
+              <w:t>considération</w:t>
+            </w:r>
+            <w:proofErr w:type="spellEnd"/>
           </w:p>
         </w:tc>
         <w:tc>
@@ -18691,13 +20115,47 @@
             <w:pPr>
               <w:jc w:val="center"/>
             </w:pPr>
+            <w:proofErr w:type="spellStart"/>
             <w:r>
               <w:rPr>
                 <w:b/>
                 <w:sz w:val="19"/>
               </w:rPr>
-              <w:t>Pourquoi est-ce important ?</w:t>
-            </w:r>
+              <w:t>Pourquoi</w:t>
+            </w:r>
+            <w:proofErr w:type="spellEnd"/>
+            <w:r>
+              <w:rPr>
+                <w:b/>
+                <w:sz w:val="19"/>
+              </w:rPr>
+              <w:t xml:space="preserve"> est-</w:t>
+            </w:r>
+            <w:proofErr w:type="spellStart"/>
+            <w:r>
+              <w:rPr>
+                <w:b/>
+                <w:sz w:val="19"/>
+              </w:rPr>
+              <w:t>ce</w:t>
+            </w:r>
+            <w:proofErr w:type="spellEnd"/>
+            <w:r>
+              <w:rPr>
+                <w:b/>
+                <w:sz w:val="19"/>
+              </w:rPr>
+              <w:t xml:space="preserve"> </w:t>
+            </w:r>
+            <w:proofErr w:type="gramStart"/>
+            <w:r>
+              <w:rPr>
+                <w:b/>
+                <w:sz w:val="19"/>
+              </w:rPr>
+              <w:t>important ?</w:t>
+            </w:r>
+            <w:proofErr w:type="gramEnd"/>
           </w:p>
         </w:tc>
         <w:tc>
@@ -18716,12 +20174,53 @@
             <w:pPr>
               <w:jc w:val="center"/>
             </w:pPr>
+            <w:proofErr w:type="spellStart"/>
             <w:r>
               <w:rPr>
                 <w:b/>
                 <w:sz w:val="19"/>
               </w:rPr>
-              <w:t>Mesure ou précaution possible</w:t>
+              <w:t>Mesure</w:t>
+            </w:r>
+            <w:proofErr w:type="spellEnd"/>
+            <w:r>
+              <w:rPr>
+                <w:b/>
+                <w:sz w:val="19"/>
+              </w:rPr>
+              <w:t xml:space="preserve"> </w:t>
+            </w:r>
+            <w:proofErr w:type="spellStart"/>
+            <w:r>
+              <w:rPr>
+                <w:b/>
+                <w:sz w:val="19"/>
+              </w:rPr>
+              <w:t>ou</w:t>
+            </w:r>
+            <w:proofErr w:type="spellEnd"/>
+            <w:r>
+              <w:rPr>
+                <w:b/>
+                <w:sz w:val="19"/>
+              </w:rPr>
+              <w:t xml:space="preserve"> </w:t>
+            </w:r>
+            <w:proofErr w:type="spellStart"/>
+            <w:r>
+              <w:rPr>
+                <w:b/>
+                <w:sz w:val="19"/>
+              </w:rPr>
+              <w:t>précaution</w:t>
+            </w:r>
+            <w:proofErr w:type="spellEnd"/>
+            <w:r>
+              <w:rPr>
+                <w:b/>
+                <w:sz w:val="19"/>
+              </w:rPr>
+              <w:t xml:space="preserve"> possible</w:t>
             </w:r>
           </w:p>
         </w:tc>
@@ -18992,7 +20491,23 @@
       </w:pPr>
       <w:bookmarkStart w:id="44" w:name="_Toc1945446289"/>
       <w:r>
-        <w:t>21. Recommandations et prochaines étapes</w:t>
+        <w:t xml:space="preserve">21. </w:t>
+      </w:r>
+      <w:proofErr w:type="spellStart"/>
+      <w:r>
+        <w:t>Recommandations</w:t>
+      </w:r>
+      <w:proofErr w:type="spellEnd"/>
+      <w:r>
+        <w:t xml:space="preserve"> et </w:t>
+      </w:r>
+      <w:proofErr w:type="spellStart"/>
+      <w:r>
+        <w:t>prochaines</w:t>
+      </w:r>
+      <w:proofErr w:type="spellEnd"/>
+      <w:r>
+        <w:t xml:space="preserve"> étapes</w:t>
       </w:r>
       <w:bookmarkEnd w:id="44"/>
     </w:p>
@@ -19509,6 +21024,7 @@
             <w:pPr>
               <w:jc w:val="center"/>
             </w:pPr>
+            <w:proofErr w:type="spellStart"/>
             <w:r>
               <w:rPr>
                 <w:b/>
@@ -19517,6 +21033,7 @@
               <w:lastRenderedPageBreak/>
               <w:t>Livrable</w:t>
             </w:r>
+            <w:proofErr w:type="spellEnd"/>
           </w:p>
         </w:tc>
         <w:tc>
@@ -19535,13 +21052,31 @@
             <w:pPr>
               <w:jc w:val="center"/>
             </w:pPr>
+            <w:proofErr w:type="spellStart"/>
             <w:r>
               <w:rPr>
                 <w:b/>
                 <w:sz w:val="19"/>
               </w:rPr>
-              <w:t>Rôle dans le projet</w:t>
-            </w:r>
+              <w:t>Rôle</w:t>
+            </w:r>
+            <w:proofErr w:type="spellEnd"/>
+            <w:r>
+              <w:rPr>
+                <w:b/>
+                <w:sz w:val="19"/>
+              </w:rPr>
+              <w:t xml:space="preserve"> dans le </w:t>
+            </w:r>
+            <w:proofErr w:type="spellStart"/>
+            <w:r>
+              <w:rPr>
+                <w:b/>
+                <w:sz w:val="19"/>
+              </w:rPr>
+              <w:t>projet</w:t>
+            </w:r>
+            <w:proofErr w:type="spellEnd"/>
           </w:p>
         </w:tc>
       </w:tr>
@@ -19608,8 +21143,13 @@
           </w:tcPr>
           <w:p>
             <w:r>
-              <w:t>Journal de projet</w:t>
-            </w:r>
+              <w:t xml:space="preserve">Journal de </w:t>
+            </w:r>
+            <w:proofErr w:type="spellStart"/>
+            <w:r>
+              <w:t>projet</w:t>
+            </w:r>
+            <w:proofErr w:type="spellEnd"/>
           </w:p>
         </w:tc>
         <w:tc>
@@ -19699,8 +21239,13 @@
             </w:tcMar>
           </w:tcPr>
           <w:p>
-            <w:r>
-              <w:t>Dictionnaire de données</w:t>
+            <w:proofErr w:type="spellStart"/>
+            <w:r>
+              <w:t>Dictionnaire</w:t>
+            </w:r>
+            <w:proofErr w:type="spellEnd"/>
+            <w:r>
+              <w:t xml:space="preserve"> de données</w:t>
             </w:r>
           </w:p>
         </w:tc>
@@ -19745,9 +21290,19 @@
             </w:tcMar>
           </w:tcPr>
           <w:p>
-            <w:r>
-              <w:t>Présentations des jalons</w:t>
-            </w:r>
+            <w:proofErr w:type="spellStart"/>
+            <w:r>
+              <w:t>Présentations</w:t>
+            </w:r>
+            <w:proofErr w:type="spellEnd"/>
+            <w:r>
+              <w:t xml:space="preserve"> des </w:t>
+            </w:r>
+            <w:proofErr w:type="spellStart"/>
+            <w:r>
+              <w:t>jalons</w:t>
+            </w:r>
+            <w:proofErr w:type="spellEnd"/>
           </w:p>
         </w:tc>
         <w:tc>
@@ -19838,8 +21393,13 @@
           </w:tcPr>
           <w:p>
             <w:r>
-              <w:t>Prototype / démonstration</w:t>
-            </w:r>
+              <w:t xml:space="preserve">Prototype / </w:t>
+            </w:r>
+            <w:proofErr w:type="spellStart"/>
+            <w:r>
+              <w:t>démonstration</w:t>
+            </w:r>
+            <w:proofErr w:type="spellEnd"/>
           </w:p>
         </w:tc>
         <w:tc>
@@ -19920,6 +21480,7 @@
             <w:pPr>
               <w:jc w:val="center"/>
             </w:pPr>
+            <w:proofErr w:type="spellStart"/>
             <w:r>
               <w:rPr>
                 <w:b/>
@@ -19927,6 +21488,7 @@
               </w:rPr>
               <w:t>Élément</w:t>
             </w:r>
+            <w:proofErr w:type="spellEnd"/>
           </w:p>
         </w:tc>
         <w:tc>
@@ -19950,8 +21512,17 @@
                 <w:b/>
                 <w:sz w:val="19"/>
               </w:rPr>
-              <w:t>Exigence / choix de l’équipe</w:t>
-            </w:r>
+              <w:t xml:space="preserve">Exigence / choix de </w:t>
+            </w:r>
+            <w:proofErr w:type="spellStart"/>
+            <w:r>
+              <w:rPr>
+                <w:b/>
+                <w:sz w:val="19"/>
+              </w:rPr>
+              <w:t>l’équipe</w:t>
+            </w:r>
+            <w:proofErr w:type="spellEnd"/>
           </w:p>
         </w:tc>
       </w:tr>
@@ -19971,8 +21542,13 @@
             </w:tcMar>
           </w:tcPr>
           <w:p>
-            <w:r>
-              <w:t>Langage principal</w:t>
+            <w:proofErr w:type="spellStart"/>
+            <w:r>
+              <w:t>Langage</w:t>
+            </w:r>
+            <w:proofErr w:type="spellEnd"/>
+            <w:r>
+              <w:t xml:space="preserve"> principal</w:t>
             </w:r>
           </w:p>
         </w:tc>
@@ -20034,7 +21610,23 @@
           </w:tcPr>
           <w:p>
             <w:r>
-              <w:t>Jupyter Notebook, Google Colab et/ou Visual Studio Code.</w:t>
+              <w:t xml:space="preserve">Jupyter Notebook, Google </w:t>
+            </w:r>
+            <w:proofErr w:type="spellStart"/>
+            <w:r>
+              <w:t>Colab</w:t>
+            </w:r>
+            <w:proofErr w:type="spellEnd"/>
+            <w:r>
+              <w:t xml:space="preserve"> et/</w:t>
+            </w:r>
+            <w:proofErr w:type="spellStart"/>
+            <w:r>
+              <w:t>ou</w:t>
+            </w:r>
+            <w:proofErr w:type="spellEnd"/>
+            <w:r>
+              <w:t xml:space="preserve"> Visual Studio Code.</w:t>
             </w:r>
           </w:p>
         </w:tc>
@@ -20080,7 +21672,63 @@
               <w:rPr>
                 <w:lang w:val="fr-CA"/>
               </w:rPr>
-              <w:t>Pandas, NumPy, Matplotlib, Scikit-learn, TensorFlow ou autres bibliothèques pertinentes.</w:t>
+              <w:t xml:space="preserve">Pandas, </w:t>
+            </w:r>
+            <w:proofErr w:type="spellStart"/>
+            <w:r>
+              <w:rPr>
+                <w:lang w:val="fr-CA"/>
+              </w:rPr>
+              <w:t>NumPy</w:t>
+            </w:r>
+            <w:proofErr w:type="spellEnd"/>
+            <w:r>
+              <w:rPr>
+                <w:lang w:val="fr-CA"/>
+              </w:rPr>
+              <w:t xml:space="preserve">, </w:t>
+            </w:r>
+            <w:proofErr w:type="spellStart"/>
+            <w:r>
+              <w:rPr>
+                <w:lang w:val="fr-CA"/>
+              </w:rPr>
+              <w:t>Matplotlib</w:t>
+            </w:r>
+            <w:proofErr w:type="spellEnd"/>
+            <w:r>
+              <w:rPr>
+                <w:lang w:val="fr-CA"/>
+              </w:rPr>
+              <w:t xml:space="preserve">, </w:t>
+            </w:r>
+            <w:proofErr w:type="spellStart"/>
+            <w:r>
+              <w:rPr>
+                <w:lang w:val="fr-CA"/>
+              </w:rPr>
+              <w:t>Scikit-learn</w:t>
+            </w:r>
+            <w:proofErr w:type="spellEnd"/>
+            <w:r>
+              <w:rPr>
+                <w:lang w:val="fr-CA"/>
+              </w:rPr>
+              <w:t xml:space="preserve">, </w:t>
+            </w:r>
+            <w:proofErr w:type="spellStart"/>
+            <w:r>
+              <w:rPr>
+                <w:lang w:val="fr-CA"/>
+              </w:rPr>
+              <w:t>TensorFlow</w:t>
+            </w:r>
+            <w:proofErr w:type="spellEnd"/>
+            <w:r>
+              <w:rPr>
+                <w:lang w:val="fr-CA"/>
+              </w:rPr>
+              <w:t xml:space="preserve"> ou autres bibliothèques pertinentes.</w:t>
             </w:r>
           </w:p>
         </w:tc>
@@ -20101,9 +21749,11 @@
             </w:tcMar>
           </w:tcPr>
           <w:p>
+            <w:proofErr w:type="spellStart"/>
             <w:r>
               <w:t>Déploiement</w:t>
             </w:r>
+            <w:proofErr w:type="spellEnd"/>
           </w:p>
         </w:tc>
         <w:tc>
@@ -20311,6 +21961,7 @@
             <w:pPr>
               <w:jc w:val="center"/>
             </w:pPr>
+            <w:proofErr w:type="spellStart"/>
             <w:r>
               <w:rPr>
                 <w:b/>
@@ -20318,6 +21969,7 @@
               </w:rPr>
               <w:t>Exemple</w:t>
             </w:r>
+            <w:proofErr w:type="spellEnd"/>
           </w:p>
         </w:tc>
         <w:tc>
@@ -20341,8 +21993,17 @@
                 <w:b/>
                 <w:sz w:val="19"/>
               </w:rPr>
-              <w:t>Transformation / utilisation</w:t>
-            </w:r>
+              <w:t xml:space="preserve">Transformation / </w:t>
+            </w:r>
+            <w:proofErr w:type="spellStart"/>
+            <w:r>
+              <w:rPr>
+                <w:b/>
+                <w:sz w:val="19"/>
+              </w:rPr>
+              <w:t>utilisation</w:t>
+            </w:r>
+            <w:proofErr w:type="spellEnd"/>
           </w:p>
         </w:tc>
       </w:tr>
@@ -20864,14 +22525,24 @@
         <w:spacing w:before="100" w:after="80"/>
       </w:pPr>
       <w:bookmarkStart w:id="50" w:name="_Toc2145171832"/>
-      <w:r>
-        <w:t xml:space="preserve">Annexe B </w:t>
+      <w:proofErr w:type="spellStart"/>
+      <w:r>
+        <w:t>Annexe</w:t>
+      </w:r>
+      <w:proofErr w:type="spellEnd"/>
+      <w:r>
+        <w:t xml:space="preserve"> B </w:t>
       </w:r>
       <w:r>
         <w:t xml:space="preserve">- </w:t>
       </w:r>
-      <w:r>
-        <w:t>Références et sources</w:t>
+      <w:proofErr w:type="spellStart"/>
+      <w:r>
+        <w:t>Références</w:t>
+      </w:r>
+      <w:proofErr w:type="spellEnd"/>
+      <w:r>
+        <w:t xml:space="preserve"> et sources</w:t>
       </w:r>
       <w:bookmarkEnd w:id="50"/>
     </w:p>
@@ -21215,7 +22886,39 @@
         <w:sz w:val="16"/>
         <w:lang w:val="fr-CA"/>
       </w:rPr>
-      <w:t xml:space="preserve">Projet IA : Méthodologie et déploiement  |  Cahier de charges  |  </w:t>
+      <w:t xml:space="preserve">Projet IA : Méthodologie et </w:t>
+    </w:r>
+    <w:proofErr w:type="gramStart"/>
+    <w:r>
+      <w:rPr>
+        <w:sz w:val="16"/>
+        <w:lang w:val="fr-CA"/>
+      </w:rPr>
+      <w:t>déploiement  |</w:t>
+    </w:r>
+    <w:proofErr w:type="gramEnd"/>
+    <w:r>
+      <w:rPr>
+        <w:sz w:val="16"/>
+        <w:lang w:val="fr-CA"/>
+      </w:rPr>
+      <w:t xml:space="preserve">  Cahier de </w:t>
+    </w:r>
+    <w:proofErr w:type="gramStart"/>
+    <w:r>
+      <w:rPr>
+        <w:sz w:val="16"/>
+        <w:lang w:val="fr-CA"/>
+      </w:rPr>
+      <w:t>charges  |</w:t>
+    </w:r>
+    <w:proofErr w:type="gramEnd"/>
+    <w:r>
+      <w:rPr>
+        <w:sz w:val="16"/>
+        <w:lang w:val="fr-CA"/>
+      </w:rPr>
+      <w:t xml:space="preserve">  </w:t>
     </w:r>
     <w:r>
       <w:rPr>
@@ -21322,7 +23025,21 @@
             <w:rPr>
               <w:color w:val="FF0000"/>
             </w:rPr>
-            <w:t>Version du 16 septembre 2026</w:t>
+            <w:t xml:space="preserve">Version du 16 </w:t>
+          </w:r>
+          <w:proofErr w:type="spellStart"/>
+          <w:r>
+            <w:rPr>
+              <w:color w:val="FF0000"/>
+            </w:rPr>
+            <w:t>septembre</w:t>
+          </w:r>
+          <w:proofErr w:type="spellEnd"/>
+          <w:r>
+            <w:rPr>
+              <w:color w:val="FF0000"/>
+            </w:rPr>
+            <w:t xml:space="preserve"> 2026</w:t>
           </w:r>
         </w:p>
       </w:tc>
@@ -23464,7 +25181,6 @@
   <w:style w:type="character" w:default="1" w:styleId="Policepardfaut">
     <w:name w:val="Default Paragraph Font"/>
     <w:uiPriority w:val="1"/>
-    <w:semiHidden/>
     <w:unhideWhenUsed/>
   </w:style>
   <w:style w:type="table" w:default="1" w:styleId="TableauNormal">

</xml_diff>